<commit_message>
Update transcript metrics results
</commit_message>
<xml_diff>
--- a/TranscriptAnalysis/results/metrics/Conventional_metrics.docx
+++ b/TranscriptAnalysis/results/metrics/Conventional_metrics.docx
@@ -256,7 +256,7 @@
           </w:tcPr>
           <w:p>
             <w:r>
-              <w:t>—</w:t>
+              <w:t>415.43</w:t>
             </w:r>
           </w:p>
         </w:tc>
@@ -358,7 +358,7 @@
           </w:tcPr>
           <w:p>
             <w:r>
-              <w:t>—</w:t>
+              <w:t>411.81</w:t>
             </w:r>
           </w:p>
         </w:tc>
@@ -460,7 +460,7 @@
           </w:tcPr>
           <w:p>
             <w:r>
-              <w:t>—</w:t>
+              <w:t>1314.34</w:t>
             </w:r>
           </w:p>
         </w:tc>
@@ -562,7 +562,7 @@
           </w:tcPr>
           <w:p>
             <w:r>
-              <w:t>—</w:t>
+              <w:t>204.94</w:t>
             </w:r>
           </w:p>
         </w:tc>
@@ -664,7 +664,7 @@
           </w:tcPr>
           <w:p>
             <w:r>
-              <w:t>—</w:t>
+              <w:t>632.02</w:t>
             </w:r>
           </w:p>
         </w:tc>
@@ -766,7 +766,7 @@
           </w:tcPr>
           <w:p>
             <w:r>
-              <w:t>—</w:t>
+              <w:t>828.07</w:t>
             </w:r>
           </w:p>
         </w:tc>
@@ -868,7 +868,7 @@
           </w:tcPr>
           <w:p>
             <w:r>
-              <w:t>—</w:t>
+              <w:t>396.99</w:t>
             </w:r>
           </w:p>
         </w:tc>
@@ -970,7 +970,7 @@
           </w:tcPr>
           <w:p>
             <w:r>
-              <w:t>—</w:t>
+              <w:t>1354.86</w:t>
             </w:r>
           </w:p>
         </w:tc>
@@ -1072,7 +1072,7 @@
           </w:tcPr>
           <w:p>
             <w:r>
-              <w:t>—</w:t>
+              <w:t>306.27</w:t>
             </w:r>
           </w:p>
         </w:tc>
@@ -1174,7 +1174,7 @@
           </w:tcPr>
           <w:p>
             <w:r>
-              <w:t>—</w:t>
+              <w:t>1236.21</w:t>
             </w:r>
           </w:p>
         </w:tc>
@@ -1276,7 +1276,7 @@
           </w:tcPr>
           <w:p>
             <w:r>
-              <w:t>—</w:t>
+              <w:t>144.08</w:t>
             </w:r>
           </w:p>
         </w:tc>
@@ -1378,7 +1378,7 @@
           </w:tcPr>
           <w:p>
             <w:r>
-              <w:t>—</w:t>
+              <w:t>648.30</w:t>
             </w:r>
           </w:p>
         </w:tc>
@@ -1480,7 +1480,7 @@
           </w:tcPr>
           <w:p>
             <w:r>
-              <w:t>—</w:t>
+              <w:t>809.12</w:t>
             </w:r>
           </w:p>
         </w:tc>
@@ -1582,7 +1582,7 @@
           </w:tcPr>
           <w:p>
             <w:r>
-              <w:t>—</w:t>
+              <w:t>1043.69</w:t>
             </w:r>
           </w:p>
         </w:tc>
@@ -1684,7 +1684,7 @@
           </w:tcPr>
           <w:p>
             <w:r>
-              <w:t>—</w:t>
+              <w:t>946.63</w:t>
             </w:r>
           </w:p>
         </w:tc>
@@ -1786,7 +1786,7 @@
           </w:tcPr>
           <w:p>
             <w:r>
-              <w:t>—</w:t>
+              <w:t>894.48</w:t>
             </w:r>
           </w:p>
         </w:tc>
@@ -1888,7 +1888,7 @@
           </w:tcPr>
           <w:p>
             <w:r>
-              <w:t>—</w:t>
+              <w:t>465.82</w:t>
             </w:r>
           </w:p>
         </w:tc>
@@ -1990,7 +1990,7 @@
           </w:tcPr>
           <w:p>
             <w:r>
-              <w:t>—</w:t>
+              <w:t>1071.37</w:t>
             </w:r>
           </w:p>
         </w:tc>
@@ -2092,7 +2092,7 @@
           </w:tcPr>
           <w:p>
             <w:r>
-              <w:t>—</w:t>
+              <w:t>656.82</w:t>
             </w:r>
           </w:p>
         </w:tc>
@@ -2194,7 +2194,7 @@
           </w:tcPr>
           <w:p>
             <w:r>
-              <w:t>—</w:t>
+              <w:t>508.98</w:t>
             </w:r>
           </w:p>
         </w:tc>
@@ -2296,7 +2296,7 @@
           </w:tcPr>
           <w:p>
             <w:r>
-              <w:t>—</w:t>
+              <w:t>372.91</w:t>
             </w:r>
           </w:p>
         </w:tc>
@@ -2398,7 +2398,7 @@
           </w:tcPr>
           <w:p>
             <w:r>
-              <w:t>—</w:t>
+              <w:t>210.23</w:t>
             </w:r>
           </w:p>
         </w:tc>
@@ -2500,7 +2500,7 @@
           </w:tcPr>
           <w:p>
             <w:r>
-              <w:t>—</w:t>
+              <w:t>512.58</w:t>
             </w:r>
           </w:p>
         </w:tc>
@@ -2602,7 +2602,7 @@
           </w:tcPr>
           <w:p>
             <w:r>
-              <w:t>—</w:t>
+              <w:t>1259.87</w:t>
             </w:r>
           </w:p>
         </w:tc>
@@ -2704,7 +2704,7 @@
           </w:tcPr>
           <w:p>
             <w:r>
-              <w:t>—</w:t>
+              <w:t>437.60</w:t>
             </w:r>
           </w:p>
         </w:tc>
@@ -2806,7 +2806,7 @@
           </w:tcPr>
           <w:p>
             <w:r>
-              <w:t>—</w:t>
+              <w:t>1138.78</w:t>
             </w:r>
           </w:p>
         </w:tc>
@@ -2908,7 +2908,7 @@
           </w:tcPr>
           <w:p>
             <w:r>
-              <w:t>—</w:t>
+              <w:t>2315.80</w:t>
             </w:r>
           </w:p>
         </w:tc>
@@ -3010,7 +3010,7 @@
           </w:tcPr>
           <w:p>
             <w:r>
-              <w:t>—</w:t>
+              <w:t>669.18</w:t>
             </w:r>
           </w:p>
         </w:tc>
@@ -3112,7 +3112,7 @@
           </w:tcPr>
           <w:p>
             <w:r>
-              <w:t>—</w:t>
+              <w:t>745.34</w:t>
             </w:r>
           </w:p>
         </w:tc>
@@ -3214,7 +3214,7 @@
           </w:tcPr>
           <w:p>
             <w:r>
-              <w:t>—</w:t>
+              <w:t>2109.58</w:t>
             </w:r>
           </w:p>
         </w:tc>
@@ -3316,7 +3316,7 @@
           </w:tcPr>
           <w:p>
             <w:r>
-              <w:t>—</w:t>
+              <w:t>1082.84</w:t>
             </w:r>
           </w:p>
         </w:tc>
@@ -3418,7 +3418,7 @@
           </w:tcPr>
           <w:p>
             <w:r>
-              <w:t>—</w:t>
+              <w:t>2957.36</w:t>
             </w:r>
           </w:p>
         </w:tc>
@@ -3520,7 +3520,7 @@
           </w:tcPr>
           <w:p>
             <w:r>
-              <w:t>—</w:t>
+              <w:t>1283.34</w:t>
             </w:r>
           </w:p>
         </w:tc>
@@ -3622,7 +3622,7 @@
           </w:tcPr>
           <w:p>
             <w:r>
-              <w:t>—</w:t>
+              <w:t>926.48</w:t>
             </w:r>
           </w:p>
         </w:tc>
@@ -3724,7 +3724,7 @@
           </w:tcPr>
           <w:p>
             <w:r>
-              <w:t>—</w:t>
+              <w:t>302.18</w:t>
             </w:r>
           </w:p>
         </w:tc>
@@ -3826,7 +3826,7 @@
           </w:tcPr>
           <w:p>
             <w:r>
-              <w:t>—</w:t>
+              <w:t>1474.91</w:t>
             </w:r>
           </w:p>
         </w:tc>
@@ -3928,7 +3928,7 @@
           </w:tcPr>
           <w:p>
             <w:r>
-              <w:t>—</w:t>
+              <w:t>775.29</w:t>
             </w:r>
           </w:p>
         </w:tc>
@@ -4030,7 +4030,7 @@
           </w:tcPr>
           <w:p>
             <w:r>
-              <w:t>—</w:t>
+              <w:t>1029.22</w:t>
             </w:r>
           </w:p>
         </w:tc>
@@ -4132,7 +4132,7 @@
           </w:tcPr>
           <w:p>
             <w:r>
-              <w:t>—</w:t>
+              <w:t>851.66</w:t>
             </w:r>
           </w:p>
         </w:tc>
@@ -4234,7 +4234,7 @@
           </w:tcPr>
           <w:p>
             <w:r>
-              <w:t>—</w:t>
+              <w:t>2147.96</w:t>
             </w:r>
           </w:p>
         </w:tc>
@@ -4336,7 +4336,7 @@
           </w:tcPr>
           <w:p>
             <w:r>
-              <w:t>—</w:t>
+              <w:t>359.33</w:t>
             </w:r>
           </w:p>
         </w:tc>
@@ -4438,7 +4438,7 @@
           </w:tcPr>
           <w:p>
             <w:r>
-              <w:t>—</w:t>
+              <w:t>313.40</w:t>
             </w:r>
           </w:p>
         </w:tc>
@@ -4540,7 +4540,7 @@
           </w:tcPr>
           <w:p>
             <w:r>
-              <w:t>—</w:t>
+              <w:t>967.37</w:t>
             </w:r>
           </w:p>
         </w:tc>
@@ -4642,7 +4642,7 @@
           </w:tcPr>
           <w:p>
             <w:r>
-              <w:t>—</w:t>
+              <w:t>789.85</w:t>
             </w:r>
           </w:p>
         </w:tc>
@@ -4744,7 +4744,7 @@
           </w:tcPr>
           <w:p>
             <w:r>
-              <w:t>—</w:t>
+              <w:t>1304.29</w:t>
             </w:r>
           </w:p>
         </w:tc>
@@ -4846,7 +4846,7 @@
           </w:tcPr>
           <w:p>
             <w:r>
-              <w:t>—</w:t>
+              <w:t>483.86</w:t>
             </w:r>
           </w:p>
         </w:tc>
@@ -4948,7 +4948,7 @@
           </w:tcPr>
           <w:p>
             <w:r>
-              <w:t>—</w:t>
+              <w:t>961.45</w:t>
             </w:r>
           </w:p>
         </w:tc>
@@ -5050,7 +5050,7 @@
           </w:tcPr>
           <w:p>
             <w:r>
-              <w:t>—</w:t>
+              <w:t>198.90</w:t>
             </w:r>
           </w:p>
         </w:tc>
@@ -5152,7 +5152,7 @@
           </w:tcPr>
           <w:p>
             <w:r>
-              <w:t>—</w:t>
+              <w:t>1338.47</w:t>
             </w:r>
           </w:p>
         </w:tc>
@@ -5254,7 +5254,7 @@
           </w:tcPr>
           <w:p>
             <w:r>
-              <w:t>—</w:t>
+              <w:t>267.82</w:t>
             </w:r>
           </w:p>
         </w:tc>
@@ -5356,7 +5356,7 @@
           </w:tcPr>
           <w:p>
             <w:r>
-              <w:t>—</w:t>
+              <w:t>478.38</w:t>
             </w:r>
           </w:p>
         </w:tc>
@@ -5458,7 +5458,7 @@
           </w:tcPr>
           <w:p>
             <w:r>
-              <w:t>—</w:t>
+              <w:t>5766.19</w:t>
             </w:r>
           </w:p>
         </w:tc>
@@ -5560,7 +5560,7 @@
           </w:tcPr>
           <w:p>
             <w:r>
-              <w:t>—</w:t>
+              <w:t>258.72</w:t>
             </w:r>
           </w:p>
         </w:tc>
@@ -5662,7 +5662,7 @@
           </w:tcPr>
           <w:p>
             <w:r>
-              <w:t>—</w:t>
+              <w:t>2431.83</w:t>
             </w:r>
           </w:p>
         </w:tc>
@@ -5764,7 +5764,7 @@
           </w:tcPr>
           <w:p>
             <w:r>
-              <w:t>—</w:t>
+              <w:t>230.04</w:t>
             </w:r>
           </w:p>
         </w:tc>
@@ -5866,7 +5866,7 @@
           </w:tcPr>
           <w:p>
             <w:r>
-              <w:t>—</w:t>
+              <w:t>938.97</w:t>
             </w:r>
           </w:p>
         </w:tc>

</xml_diff>

<commit_message>
Update transcript analysis metrics
</commit_message>
<xml_diff>
--- a/TranscriptAnalysis/results/metrics/Conventional_metrics.docx
+++ b/TranscriptAnalysis/results/metrics/Conventional_metrics.docx
@@ -25,17 +25,17 @@
       <w:r>
         <w:t>Videos: 56</w:t>
         <w:br/>
-        <w:t>Avg frames: 0</w:t>
+        <w:t>Avg frames: 306.07</w:t>
         <w:br/>
         <w:t>Avg transcript words: 2636.88</w:t>
         <w:br/>
         <w:t>Avg topics: 4.38</w:t>
         <w:br/>
-        <w:t>Avg comments: 1.91</w:t>
+        <w:t>Avg comments: 1.79</w:t>
         <w:br/>
-        <w:t>Avg of per-video correlation averages: 53.513</w:t>
+        <w:t>Avg of per-video correlation averages: 51.75</w:t>
         <w:br/>
-        <w:t>Median of per-video correlation averages: 57.621</w:t>
+        <w:t>Median of per-video correlation averages: 47.972</w:t>
         <w:br/>
         <w:t>Threshold for counted correlations: &gt;= 60</w:t>
       </w:r>
@@ -176,7 +176,7 @@
           </w:tcPr>
           <w:p>
             <w:r>
-              <w:t>0</w:t>
+              <w:t>125</w:t>
             </w:r>
           </w:p>
         </w:tc>
@@ -206,37 +206,37 @@
           </w:tcPr>
           <w:p>
             <w:r>
-              <w:t>62.318</w:t>
-            </w:r>
-          </w:p>
-        </w:tc>
-        <w:tc>
-          <w:tcPr>
-            <w:tcW w:type="dxa" w:w="864"/>
-          </w:tcPr>
-          <w:p>
-            <w:r>
-              <w:t>80.000</w:t>
-            </w:r>
-          </w:p>
-        </w:tc>
-        <w:tc>
-          <w:tcPr>
-            <w:tcW w:type="dxa" w:w="864"/>
-          </w:tcPr>
-          <w:p>
-            <w:r>
-              <w:t>387</w:t>
-            </w:r>
-          </w:p>
-        </w:tc>
-        <w:tc>
-          <w:tcPr>
-            <w:tcW w:type="dxa" w:w="864"/>
-          </w:tcPr>
-          <w:p>
-            <w:r>
-              <w:t>264</w:t>
+              <w:t>41.250</w:t>
+            </w:r>
+          </w:p>
+        </w:tc>
+        <w:tc>
+          <w:tcPr>
+            <w:tcW w:type="dxa" w:w="864"/>
+          </w:tcPr>
+          <w:p>
+            <w:r>
+              <w:t>20.000</w:t>
+            </w:r>
+          </w:p>
+        </w:tc>
+        <w:tc>
+          <w:tcPr>
+            <w:tcW w:type="dxa" w:w="864"/>
+          </w:tcPr>
+          <w:p>
+            <w:r>
+              <w:t>12</w:t>
+            </w:r>
+          </w:p>
+        </w:tc>
+        <w:tc>
+          <w:tcPr>
+            <w:tcW w:type="dxa" w:w="864"/>
+          </w:tcPr>
+          <w:p>
+            <w:r>
+              <w:t>4</w:t>
             </w:r>
           </w:p>
         </w:tc>
@@ -278,7 +278,7 @@
           </w:tcPr>
           <w:p>
             <w:r>
-              <w:t>0</w:t>
+              <w:t>247</w:t>
             </w:r>
           </w:p>
         </w:tc>
@@ -308,7 +308,7 @@
           </w:tcPr>
           <w:p>
             <w:r>
-              <w:t>61.238</w:t>
+              <w:t>56.000</w:t>
             </w:r>
           </w:p>
         </w:tc>
@@ -328,17 +328,17 @@
           </w:tcPr>
           <w:p>
             <w:r>
-              <w:t>252</w:t>
-            </w:r>
-          </w:p>
-        </w:tc>
-        <w:tc>
-          <w:tcPr>
-            <w:tcW w:type="dxa" w:w="864"/>
-          </w:tcPr>
-          <w:p>
-            <w:r>
-              <w:t>171</w:t>
+              <w:t>5</w:t>
+            </w:r>
+          </w:p>
+        </w:tc>
+        <w:tc>
+          <w:tcPr>
+            <w:tcW w:type="dxa" w:w="864"/>
+          </w:tcPr>
+          <w:p>
+            <w:r>
+              <w:t>3</w:t>
             </w:r>
           </w:p>
         </w:tc>
@@ -380,7 +380,7 @@
           </w:tcPr>
           <w:p>
             <w:r>
-              <w:t>0</w:t>
+              <w:t>394</w:t>
             </w:r>
           </w:p>
         </w:tc>
@@ -410,37 +410,37 @@
           </w:tcPr>
           <w:p>
             <w:r>
-              <w:t>27.551</w:t>
-            </w:r>
-          </w:p>
-        </w:tc>
-        <w:tc>
-          <w:tcPr>
-            <w:tcW w:type="dxa" w:w="864"/>
-          </w:tcPr>
-          <w:p>
-            <w:r>
-              <w:t>20.000</w:t>
-            </w:r>
-          </w:p>
-        </w:tc>
-        <w:tc>
-          <w:tcPr>
-            <w:tcW w:type="dxa" w:w="864"/>
-          </w:tcPr>
-          <w:p>
-            <w:r>
-              <w:t>1600</w:t>
-            </w:r>
-          </w:p>
-        </w:tc>
-        <w:tc>
-          <w:tcPr>
-            <w:tcW w:type="dxa" w:w="864"/>
-          </w:tcPr>
-          <w:p>
-            <w:r>
-              <w:t>407</w:t>
+              <w:t>54.375</w:t>
+            </w:r>
+          </w:p>
+        </w:tc>
+        <w:tc>
+          <w:tcPr>
+            <w:tcW w:type="dxa" w:w="864"/>
+          </w:tcPr>
+          <w:p>
+            <w:r>
+              <w:t>80.000</w:t>
+            </w:r>
+          </w:p>
+        </w:tc>
+        <w:tc>
+          <w:tcPr>
+            <w:tcW w:type="dxa" w:w="864"/>
+          </w:tcPr>
+          <w:p>
+            <w:r>
+              <w:t>24</w:t>
+            </w:r>
+          </w:p>
+        </w:tc>
+        <w:tc>
+          <w:tcPr>
+            <w:tcW w:type="dxa" w:w="864"/>
+          </w:tcPr>
+          <w:p>
+            <w:r>
+              <w:t>14</w:t>
             </w:r>
           </w:p>
         </w:tc>
@@ -482,7 +482,7 @@
           </w:tcPr>
           <w:p>
             <w:r>
-              <w:t>0</w:t>
+              <w:t>62</w:t>
             </w:r>
           </w:p>
         </w:tc>
@@ -512,37 +512,37 @@
           </w:tcPr>
           <w:p>
             <w:r>
-              <w:t>68.162</w:t>
-            </w:r>
-          </w:p>
-        </w:tc>
-        <w:tc>
-          <w:tcPr>
-            <w:tcW w:type="dxa" w:w="864"/>
-          </w:tcPr>
-          <w:p>
-            <w:r>
-              <w:t>80.000</w:t>
-            </w:r>
-          </w:p>
-        </w:tc>
-        <w:tc>
-          <w:tcPr>
-            <w:tcW w:type="dxa" w:w="864"/>
-          </w:tcPr>
-          <w:p>
-            <w:r>
-              <w:t>68</w:t>
-            </w:r>
-          </w:p>
-        </w:tc>
-        <w:tc>
-          <w:tcPr>
-            <w:tcW w:type="dxa" w:w="864"/>
-          </w:tcPr>
-          <w:p>
-            <w:r>
-              <w:t>53</w:t>
+              <w:t>85.000</w:t>
+            </w:r>
+          </w:p>
+        </w:tc>
+        <w:tc>
+          <w:tcPr>
+            <w:tcW w:type="dxa" w:w="864"/>
+          </w:tcPr>
+          <w:p>
+            <w:r>
+              <w:t>85.000</w:t>
+            </w:r>
+          </w:p>
+        </w:tc>
+        <w:tc>
+          <w:tcPr>
+            <w:tcW w:type="dxa" w:w="864"/>
+          </w:tcPr>
+          <w:p>
+            <w:r>
+              <w:t>6</w:t>
+            </w:r>
+          </w:p>
+        </w:tc>
+        <w:tc>
+          <w:tcPr>
+            <w:tcW w:type="dxa" w:w="864"/>
+          </w:tcPr>
+          <w:p>
+            <w:r>
+              <w:t>6</w:t>
             </w:r>
           </w:p>
         </w:tc>
@@ -584,6 +584,16 @@
           </w:tcPr>
           <w:p>
             <w:r>
+              <w:t>152</w:t>
+            </w:r>
+          </w:p>
+        </w:tc>
+        <w:tc>
+          <w:tcPr>
+            <w:tcW w:type="dxa" w:w="864"/>
+          </w:tcPr>
+          <w:p>
+            <w:r>
               <w:t>0</w:t>
             </w:r>
           </w:p>
@@ -604,47 +614,37 @@
           </w:tcPr>
           <w:p>
             <w:r>
-              <w:t>1</w:t>
-            </w:r>
-          </w:p>
-        </w:tc>
-        <w:tc>
-          <w:tcPr>
-            <w:tcW w:type="dxa" w:w="864"/>
-          </w:tcPr>
-          <w:p>
-            <w:r>
-              <w:t>15.059</w:t>
-            </w:r>
-          </w:p>
-        </w:tc>
-        <w:tc>
-          <w:tcPr>
-            <w:tcW w:type="dxa" w:w="864"/>
-          </w:tcPr>
-          <w:p>
-            <w:r>
-              <w:t>20.000</w:t>
-            </w:r>
-          </w:p>
-        </w:tc>
-        <w:tc>
-          <w:tcPr>
-            <w:tcW w:type="dxa" w:w="864"/>
-          </w:tcPr>
-          <w:p>
-            <w:r>
-              <w:t>152</w:t>
-            </w:r>
-          </w:p>
-        </w:tc>
-        <w:tc>
-          <w:tcPr>
-            <w:tcW w:type="dxa" w:w="864"/>
-          </w:tcPr>
-          <w:p>
-            <w:r>
-              <w:t>9</w:t>
+              <w:t>—</w:t>
+            </w:r>
+          </w:p>
+        </w:tc>
+        <w:tc>
+          <w:tcPr>
+            <w:tcW w:type="dxa" w:w="864"/>
+          </w:tcPr>
+          <w:p>
+            <w:r>
+              <w:t>—</w:t>
+            </w:r>
+          </w:p>
+        </w:tc>
+        <w:tc>
+          <w:tcPr>
+            <w:tcW w:type="dxa" w:w="864"/>
+          </w:tcPr>
+          <w:p>
+            <w:r>
+              <w:t>0</w:t>
+            </w:r>
+          </w:p>
+        </w:tc>
+        <w:tc>
+          <w:tcPr>
+            <w:tcW w:type="dxa" w:w="864"/>
+          </w:tcPr>
+          <w:p>
+            <w:r>
+              <w:t>0</w:t>
             </w:r>
           </w:p>
         </w:tc>
@@ -686,7 +686,7 @@
           </w:tcPr>
           <w:p>
             <w:r>
-              <w:t>0</w:t>
+              <w:t>249</w:t>
             </w:r>
           </w:p>
         </w:tc>
@@ -716,37 +716,37 @@
           </w:tcPr>
           <w:p>
             <w:r>
-              <w:t>49.085</w:t>
-            </w:r>
-          </w:p>
-        </w:tc>
-        <w:tc>
-          <w:tcPr>
-            <w:tcW w:type="dxa" w:w="864"/>
-          </w:tcPr>
-          <w:p>
-            <w:r>
-              <w:t>30.000</w:t>
-            </w:r>
-          </w:p>
-        </w:tc>
-        <w:tc>
-          <w:tcPr>
-            <w:tcW w:type="dxa" w:w="864"/>
-          </w:tcPr>
-          <w:p>
-            <w:r>
-              <w:t>508</w:t>
-            </w:r>
-          </w:p>
-        </w:tc>
-        <w:tc>
-          <w:tcPr>
-            <w:tcW w:type="dxa" w:w="864"/>
-          </w:tcPr>
-          <w:p>
-            <w:r>
-              <w:t>240</w:t>
+              <w:t>33.000</w:t>
+            </w:r>
+          </w:p>
+        </w:tc>
+        <w:tc>
+          <w:tcPr>
+            <w:tcW w:type="dxa" w:w="864"/>
+          </w:tcPr>
+          <w:p>
+            <w:r>
+              <w:t>20.000</w:t>
+            </w:r>
+          </w:p>
+        </w:tc>
+        <w:tc>
+          <w:tcPr>
+            <w:tcW w:type="dxa" w:w="864"/>
+          </w:tcPr>
+          <w:p>
+            <w:r>
+              <w:t>10</w:t>
+            </w:r>
+          </w:p>
+        </w:tc>
+        <w:tc>
+          <w:tcPr>
+            <w:tcW w:type="dxa" w:w="864"/>
+          </w:tcPr>
+          <w:p>
+            <w:r>
+              <w:t>3</w:t>
             </w:r>
           </w:p>
         </w:tc>
@@ -788,7 +788,7 @@
           </w:tcPr>
           <w:p>
             <w:r>
-              <w:t>0</w:t>
+              <w:t>119</w:t>
             </w:r>
           </w:p>
         </w:tc>
@@ -818,37 +818,37 @@
           </w:tcPr>
           <w:p>
             <w:r>
-              <w:t>61.293</w:t>
-            </w:r>
-          </w:p>
-        </w:tc>
-        <w:tc>
-          <w:tcPr>
-            <w:tcW w:type="dxa" w:w="864"/>
-          </w:tcPr>
-          <w:p>
-            <w:r>
-              <w:t>80.000</w:t>
-            </w:r>
-          </w:p>
-        </w:tc>
-        <w:tc>
-          <w:tcPr>
-            <w:tcW w:type="dxa" w:w="864"/>
-          </w:tcPr>
-          <w:p>
-            <w:r>
-              <w:t>625</w:t>
-            </w:r>
-          </w:p>
-        </w:tc>
-        <w:tc>
-          <w:tcPr>
-            <w:tcW w:type="dxa" w:w="864"/>
-          </w:tcPr>
-          <w:p>
-            <w:r>
-              <w:t>424</w:t>
+              <w:t>44.833</w:t>
+            </w:r>
+          </w:p>
+        </w:tc>
+        <w:tc>
+          <w:tcPr>
+            <w:tcW w:type="dxa" w:w="864"/>
+          </w:tcPr>
+          <w:p>
+            <w:r>
+              <w:t>20.000</w:t>
+            </w:r>
+          </w:p>
+        </w:tc>
+        <w:tc>
+          <w:tcPr>
+            <w:tcW w:type="dxa" w:w="864"/>
+          </w:tcPr>
+          <w:p>
+            <w:r>
+              <w:t>30</w:t>
+            </w:r>
+          </w:p>
+        </w:tc>
+        <w:tc>
+          <w:tcPr>
+            <w:tcW w:type="dxa" w:w="864"/>
+          </w:tcPr>
+          <w:p>
+            <w:r>
+              <w:t>12</w:t>
             </w:r>
           </w:p>
         </w:tc>
@@ -890,7 +890,7 @@
           </w:tcPr>
           <w:p>
             <w:r>
-              <w:t>0</w:t>
+              <w:t>339</w:t>
             </w:r>
           </w:p>
         </w:tc>
@@ -920,37 +920,37 @@
           </w:tcPr>
           <w:p>
             <w:r>
-              <w:t>75.851</w:t>
-            </w:r>
-          </w:p>
-        </w:tc>
-        <w:tc>
-          <w:tcPr>
-            <w:tcW w:type="dxa" w:w="864"/>
-          </w:tcPr>
-          <w:p>
-            <w:r>
-              <w:t>85.000</w:t>
-            </w:r>
-          </w:p>
-        </w:tc>
-        <w:tc>
-          <w:tcPr>
-            <w:tcW w:type="dxa" w:w="864"/>
-          </w:tcPr>
-          <w:p>
-            <w:r>
-              <w:t>349</w:t>
-            </w:r>
-          </w:p>
-        </w:tc>
-        <w:tc>
-          <w:tcPr>
-            <w:tcW w:type="dxa" w:w="864"/>
-          </w:tcPr>
-          <w:p>
-            <w:r>
-              <w:t>293</w:t>
+              <w:t>58.500</w:t>
+            </w:r>
+          </w:p>
+        </w:tc>
+        <w:tc>
+          <w:tcPr>
+            <w:tcW w:type="dxa" w:w="864"/>
+          </w:tcPr>
+          <w:p>
+            <w:r>
+              <w:t>80.000</w:t>
+            </w:r>
+          </w:p>
+        </w:tc>
+        <w:tc>
+          <w:tcPr>
+            <w:tcW w:type="dxa" w:w="864"/>
+          </w:tcPr>
+          <w:p>
+            <w:r>
+              <w:t>10</w:t>
+            </w:r>
+          </w:p>
+        </w:tc>
+        <w:tc>
+          <w:tcPr>
+            <w:tcW w:type="dxa" w:w="864"/>
+          </w:tcPr>
+          <w:p>
+            <w:r>
+              <w:t>6</w:t>
             </w:r>
           </w:p>
         </w:tc>
@@ -992,7 +992,7 @@
           </w:tcPr>
           <w:p>
             <w:r>
-              <w:t>0</w:t>
+              <w:t>184</w:t>
             </w:r>
           </w:p>
         </w:tc>
@@ -1022,37 +1022,37 @@
           </w:tcPr>
           <w:p>
             <w:r>
-              <w:t>59.836</w:t>
-            </w:r>
-          </w:p>
-        </w:tc>
-        <w:tc>
-          <w:tcPr>
-            <w:tcW w:type="dxa" w:w="864"/>
-          </w:tcPr>
-          <w:p>
-            <w:r>
-              <w:t>80.000</w:t>
-            </w:r>
-          </w:p>
-        </w:tc>
-        <w:tc>
-          <w:tcPr>
-            <w:tcW w:type="dxa" w:w="864"/>
-          </w:tcPr>
-          <w:p>
-            <w:r>
-              <w:t>378</w:t>
-            </w:r>
-          </w:p>
-        </w:tc>
-        <w:tc>
-          <w:tcPr>
-            <w:tcW w:type="dxa" w:w="864"/>
-          </w:tcPr>
-          <w:p>
-            <w:r>
-              <w:t>246</w:t>
+              <w:t>79.000</w:t>
+            </w:r>
+          </w:p>
+        </w:tc>
+        <w:tc>
+          <w:tcPr>
+            <w:tcW w:type="dxa" w:w="864"/>
+          </w:tcPr>
+          <w:p>
+            <w:r>
+              <w:t>85.000</w:t>
+            </w:r>
+          </w:p>
+        </w:tc>
+        <w:tc>
+          <w:tcPr>
+            <w:tcW w:type="dxa" w:w="864"/>
+          </w:tcPr>
+          <w:p>
+            <w:r>
+              <w:t>10</w:t>
+            </w:r>
+          </w:p>
+        </w:tc>
+        <w:tc>
+          <w:tcPr>
+            <w:tcW w:type="dxa" w:w="864"/>
+          </w:tcPr>
+          <w:p>
+            <w:r>
+              <w:t>9</w:t>
             </w:r>
           </w:p>
         </w:tc>
@@ -1094,7 +1094,7 @@
           </w:tcPr>
           <w:p>
             <w:r>
-              <w:t>0</w:t>
+              <w:t>371</w:t>
             </w:r>
           </w:p>
         </w:tc>
@@ -1124,7 +1124,7 @@
           </w:tcPr>
           <w:p>
             <w:r>
-              <w:t>52.235</w:t>
+              <w:t>76.875</w:t>
             </w:r>
           </w:p>
         </w:tc>
@@ -1144,17 +1144,17 @@
           </w:tcPr>
           <w:p>
             <w:r>
-              <w:t>1508</w:t>
-            </w:r>
-          </w:p>
-        </w:tc>
-        <w:tc>
-          <w:tcPr>
-            <w:tcW w:type="dxa" w:w="864"/>
-          </w:tcPr>
-          <w:p>
-            <w:r>
-              <w:t>826</w:t>
+              <w:t>24</w:t>
+            </w:r>
+          </w:p>
+        </w:tc>
+        <w:tc>
+          <w:tcPr>
+            <w:tcW w:type="dxa" w:w="864"/>
+          </w:tcPr>
+          <w:p>
+            <w:r>
+              <w:t>22</w:t>
             </w:r>
           </w:p>
         </w:tc>
@@ -1196,7 +1196,7 @@
           </w:tcPr>
           <w:p>
             <w:r>
-              <w:t>0</w:t>
+              <w:t>44</w:t>
             </w:r>
           </w:p>
         </w:tc>
@@ -1226,37 +1226,37 @@
           </w:tcPr>
           <w:p>
             <w:r>
-              <w:t>45.106</w:t>
-            </w:r>
-          </w:p>
-        </w:tc>
-        <w:tc>
-          <w:tcPr>
-            <w:tcW w:type="dxa" w:w="864"/>
-          </w:tcPr>
-          <w:p>
-            <w:r>
-              <w:t>20.000</w:t>
-            </w:r>
-          </w:p>
-        </w:tc>
-        <w:tc>
-          <w:tcPr>
-            <w:tcW w:type="dxa" w:w="864"/>
-          </w:tcPr>
-          <w:p>
-            <w:r>
-              <w:t>47</w:t>
-            </w:r>
-          </w:p>
-        </w:tc>
-        <w:tc>
-          <w:tcPr>
-            <w:tcW w:type="dxa" w:w="864"/>
-          </w:tcPr>
-          <w:p>
-            <w:r>
-              <w:t>21</w:t>
+              <w:t>85.000</w:t>
+            </w:r>
+          </w:p>
+        </w:tc>
+        <w:tc>
+          <w:tcPr>
+            <w:tcW w:type="dxa" w:w="864"/>
+          </w:tcPr>
+          <w:p>
+            <w:r>
+              <w:t>85.000</w:t>
+            </w:r>
+          </w:p>
+        </w:tc>
+        <w:tc>
+          <w:tcPr>
+            <w:tcW w:type="dxa" w:w="864"/>
+          </w:tcPr>
+          <w:p>
+            <w:r>
+              <w:t>3</w:t>
+            </w:r>
+          </w:p>
+        </w:tc>
+        <w:tc>
+          <w:tcPr>
+            <w:tcW w:type="dxa" w:w="864"/>
+          </w:tcPr>
+          <w:p>
+            <w:r>
+              <w:t>3</w:t>
             </w:r>
           </w:p>
         </w:tc>
@@ -1298,7 +1298,7 @@
           </w:tcPr>
           <w:p>
             <w:r>
-              <w:t>0</w:t>
+              <w:t>195</w:t>
             </w:r>
           </w:p>
         </w:tc>
@@ -1328,7 +1328,7 @@
           </w:tcPr>
           <w:p>
             <w:r>
-              <w:t>37.240</w:t>
+              <w:t>29.667</w:t>
             </w:r>
           </w:p>
         </w:tc>
@@ -1348,17 +1348,17 @@
           </w:tcPr>
           <w:p>
             <w:r>
-              <w:t>600</w:t>
-            </w:r>
-          </w:p>
-        </w:tc>
-        <w:tc>
-          <w:tcPr>
-            <w:tcW w:type="dxa" w:w="864"/>
-          </w:tcPr>
-          <w:p>
-            <w:r>
-              <w:t>188</w:t>
+              <w:t>15</w:t>
+            </w:r>
+          </w:p>
+        </w:tc>
+        <w:tc>
+          <w:tcPr>
+            <w:tcW w:type="dxa" w:w="864"/>
+          </w:tcPr>
+          <w:p>
+            <w:r>
+              <w:t>3</w:t>
             </w:r>
           </w:p>
         </w:tc>
@@ -1400,7 +1400,7 @@
           </w:tcPr>
           <w:p>
             <w:r>
-              <w:t>0</w:t>
+              <w:t>194</w:t>
             </w:r>
           </w:p>
         </w:tc>
@@ -1430,37 +1430,37 @@
           </w:tcPr>
           <w:p>
             <w:r>
-              <w:t>81.374</w:t>
-            </w:r>
-          </w:p>
-        </w:tc>
-        <w:tc>
-          <w:tcPr>
-            <w:tcW w:type="dxa" w:w="864"/>
-          </w:tcPr>
-          <w:p>
-            <w:r>
-              <w:t>85.000</w:t>
-            </w:r>
-          </w:p>
-        </w:tc>
-        <w:tc>
-          <w:tcPr>
-            <w:tcW w:type="dxa" w:w="864"/>
-          </w:tcPr>
-          <w:p>
-            <w:r>
-              <w:t>198</w:t>
-            </w:r>
-          </w:p>
-        </w:tc>
-        <w:tc>
-          <w:tcPr>
-            <w:tcW w:type="dxa" w:w="864"/>
-          </w:tcPr>
-          <w:p>
-            <w:r>
-              <w:t>181</w:t>
+              <w:t>72.500</w:t>
+            </w:r>
+          </w:p>
+        </w:tc>
+        <w:tc>
+          <w:tcPr>
+            <w:tcW w:type="dxa" w:w="864"/>
+          </w:tcPr>
+          <w:p>
+            <w:r>
+              <w:t>90.000</w:t>
+            </w:r>
+          </w:p>
+        </w:tc>
+        <w:tc>
+          <w:tcPr>
+            <w:tcW w:type="dxa" w:w="864"/>
+          </w:tcPr>
+          <w:p>
+            <w:r>
+              <w:t>4</w:t>
+            </w:r>
+          </w:p>
+        </w:tc>
+        <w:tc>
+          <w:tcPr>
+            <w:tcW w:type="dxa" w:w="864"/>
+          </w:tcPr>
+          <w:p>
+            <w:r>
+              <w:t>3</w:t>
             </w:r>
           </w:p>
         </w:tc>
@@ -1502,7 +1502,7 @@
           </w:tcPr>
           <w:p>
             <w:r>
-              <w:t>0</w:t>
+              <w:t>251</w:t>
             </w:r>
           </w:p>
         </w:tc>
@@ -1532,37 +1532,37 @@
           </w:tcPr>
           <w:p>
             <w:r>
-              <w:t>64.283</w:t>
-            </w:r>
-          </w:p>
-        </w:tc>
-        <w:tc>
-          <w:tcPr>
-            <w:tcW w:type="dxa" w:w="864"/>
-          </w:tcPr>
-          <w:p>
-            <w:r>
-              <w:t>80.000</w:t>
-            </w:r>
-          </w:p>
-        </w:tc>
-        <w:tc>
-          <w:tcPr>
-            <w:tcW w:type="dxa" w:w="864"/>
-          </w:tcPr>
-          <w:p>
-            <w:r>
-              <w:t>768</w:t>
-            </w:r>
-          </w:p>
-        </w:tc>
-        <w:tc>
-          <w:tcPr>
-            <w:tcW w:type="dxa" w:w="864"/>
-          </w:tcPr>
-          <w:p>
-            <w:r>
-              <w:t>527</w:t>
+              <w:t>83.000</w:t>
+            </w:r>
+          </w:p>
+        </w:tc>
+        <w:tc>
+          <w:tcPr>
+            <w:tcW w:type="dxa" w:w="864"/>
+          </w:tcPr>
+          <w:p>
+            <w:r>
+              <w:t>90.000</w:t>
+            </w:r>
+          </w:p>
+        </w:tc>
+        <w:tc>
+          <w:tcPr>
+            <w:tcW w:type="dxa" w:w="864"/>
+          </w:tcPr>
+          <w:p>
+            <w:r>
+              <w:t>15</w:t>
+            </w:r>
+          </w:p>
+        </w:tc>
+        <w:tc>
+          <w:tcPr>
+            <w:tcW w:type="dxa" w:w="864"/>
+          </w:tcPr>
+          <w:p>
+            <w:r>
+              <w:t>14</w:t>
             </w:r>
           </w:p>
         </w:tc>
@@ -1604,67 +1604,67 @@
           </w:tcPr>
           <w:p>
             <w:r>
+              <w:t>284</w:t>
+            </w:r>
+          </w:p>
+        </w:tc>
+        <w:tc>
+          <w:tcPr>
+            <w:tcW w:type="dxa" w:w="864"/>
+          </w:tcPr>
+          <w:p>
+            <w:r>
+              <w:t>2</w:t>
+            </w:r>
+          </w:p>
+        </w:tc>
+        <w:tc>
+          <w:tcPr>
+            <w:tcW w:type="dxa" w:w="864"/>
+          </w:tcPr>
+          <w:p>
+            <w:r>
+              <w:t>1</w:t>
+            </w:r>
+          </w:p>
+        </w:tc>
+        <w:tc>
+          <w:tcPr>
+            <w:tcW w:type="dxa" w:w="864"/>
+          </w:tcPr>
+          <w:p>
+            <w:r>
+              <w:t>20.000</w:t>
+            </w:r>
+          </w:p>
+        </w:tc>
+        <w:tc>
+          <w:tcPr>
+            <w:tcW w:type="dxa" w:w="864"/>
+          </w:tcPr>
+          <w:p>
+            <w:r>
+              <w:t>20.000</w:t>
+            </w:r>
+          </w:p>
+        </w:tc>
+        <w:tc>
+          <w:tcPr>
+            <w:tcW w:type="dxa" w:w="864"/>
+          </w:tcPr>
+          <w:p>
+            <w:r>
+              <w:t>2</w:t>
+            </w:r>
+          </w:p>
+        </w:tc>
+        <w:tc>
+          <w:tcPr>
+            <w:tcW w:type="dxa" w:w="864"/>
+          </w:tcPr>
+          <w:p>
+            <w:r>
               <w:t>0</w:t>
-            </w:r>
-          </w:p>
-        </w:tc>
-        <w:tc>
-          <w:tcPr>
-            <w:tcW w:type="dxa" w:w="864"/>
-          </w:tcPr>
-          <w:p>
-            <w:r>
-              <w:t>2</w:t>
-            </w:r>
-          </w:p>
-        </w:tc>
-        <w:tc>
-          <w:tcPr>
-            <w:tcW w:type="dxa" w:w="864"/>
-          </w:tcPr>
-          <w:p>
-            <w:r>
-              <w:t>1</w:t>
-            </w:r>
-          </w:p>
-        </w:tc>
-        <w:tc>
-          <w:tcPr>
-            <w:tcW w:type="dxa" w:w="864"/>
-          </w:tcPr>
-          <w:p>
-            <w:r>
-              <w:t>39.615</w:t>
-            </w:r>
-          </w:p>
-        </w:tc>
-        <w:tc>
-          <w:tcPr>
-            <w:tcW w:type="dxa" w:w="864"/>
-          </w:tcPr>
-          <w:p>
-            <w:r>
-              <w:t>20.000</w:t>
-            </w:r>
-          </w:p>
-        </w:tc>
-        <w:tc>
-          <w:tcPr>
-            <w:tcW w:type="dxa" w:w="864"/>
-          </w:tcPr>
-          <w:p>
-            <w:r>
-              <w:t>286</w:t>
-            </w:r>
-          </w:p>
-        </w:tc>
-        <w:tc>
-          <w:tcPr>
-            <w:tcW w:type="dxa" w:w="864"/>
-          </w:tcPr>
-          <w:p>
-            <w:r>
-              <w:t>97</w:t>
             </w:r>
           </w:p>
         </w:tc>
@@ -1706,7 +1706,7 @@
           </w:tcPr>
           <w:p>
             <w:r>
-              <w:t>0</w:t>
+              <w:t>215</w:t>
             </w:r>
           </w:p>
         </w:tc>
@@ -1736,37 +1736,37 @@
           </w:tcPr>
           <w:p>
             <w:r>
-              <w:t>67.680</w:t>
-            </w:r>
-          </w:p>
-        </w:tc>
-        <w:tc>
-          <w:tcPr>
-            <w:tcW w:type="dxa" w:w="864"/>
-          </w:tcPr>
-          <w:p>
-            <w:r>
-              <w:t>80.000</w:t>
-            </w:r>
-          </w:p>
-        </w:tc>
-        <w:tc>
-          <w:tcPr>
-            <w:tcW w:type="dxa" w:w="864"/>
-          </w:tcPr>
-          <w:p>
-            <w:r>
-              <w:t>225</w:t>
-            </w:r>
-          </w:p>
-        </w:tc>
-        <w:tc>
-          <w:tcPr>
-            <w:tcW w:type="dxa" w:w="864"/>
-          </w:tcPr>
-          <w:p>
-            <w:r>
-              <w:t>166</w:t>
+              <w:t>87.500</w:t>
+            </w:r>
+          </w:p>
+        </w:tc>
+        <w:tc>
+          <w:tcPr>
+            <w:tcW w:type="dxa" w:w="864"/>
+          </w:tcPr>
+          <w:p>
+            <w:r>
+              <w:t>87.500</w:t>
+            </w:r>
+          </w:p>
+        </w:tc>
+        <w:tc>
+          <w:tcPr>
+            <w:tcW w:type="dxa" w:w="864"/>
+          </w:tcPr>
+          <w:p>
+            <w:r>
+              <w:t>10</w:t>
+            </w:r>
+          </w:p>
+        </w:tc>
+        <w:tc>
+          <w:tcPr>
+            <w:tcW w:type="dxa" w:w="864"/>
+          </w:tcPr>
+          <w:p>
+            <w:r>
+              <w:t>10</w:t>
             </w:r>
           </w:p>
         </w:tc>
@@ -1808,7 +1808,7 @@
           </w:tcPr>
           <w:p>
             <w:r>
-              <w:t>0</w:t>
+              <w:t>140</w:t>
             </w:r>
           </w:p>
         </w:tc>
@@ -1838,7 +1838,7 @@
           </w:tcPr>
           <w:p>
             <w:r>
-              <w:t>36.863</w:t>
+              <w:t>35.455</w:t>
             </w:r>
           </w:p>
         </w:tc>
@@ -1858,17 +1858,17 @@
           </w:tcPr>
           <w:p>
             <w:r>
-              <w:t>1551</w:t>
-            </w:r>
-          </w:p>
-        </w:tc>
-        <w:tc>
-          <w:tcPr>
-            <w:tcW w:type="dxa" w:w="864"/>
-          </w:tcPr>
-          <w:p>
-            <w:r>
-              <w:t>536</w:t>
+              <w:t>11</w:t>
+            </w:r>
+          </w:p>
+        </w:tc>
+        <w:tc>
+          <w:tcPr>
+            <w:tcW w:type="dxa" w:w="864"/>
+          </w:tcPr>
+          <w:p>
+            <w:r>
+              <w:t>3</w:t>
             </w:r>
           </w:p>
         </w:tc>
@@ -1910,7 +1910,7 @@
           </w:tcPr>
           <w:p>
             <w:r>
-              <w:t>0</w:t>
+              <w:t>643</w:t>
             </w:r>
           </w:p>
         </w:tc>
@@ -1940,7 +1940,7 @@
           </w:tcPr>
           <w:p>
             <w:r>
-              <w:t>16.339</w:t>
+              <w:t>22.500</w:t>
             </w:r>
           </w:p>
         </w:tc>
@@ -1960,17 +1960,17 @@
           </w:tcPr>
           <w:p>
             <w:r>
-              <w:t>651</w:t>
-            </w:r>
-          </w:p>
-        </w:tc>
-        <w:tc>
-          <w:tcPr>
-            <w:tcW w:type="dxa" w:w="864"/>
-          </w:tcPr>
-          <w:p>
-            <w:r>
-              <w:t>89</w:t>
+              <w:t>8</w:t>
+            </w:r>
+          </w:p>
+        </w:tc>
+        <w:tc>
+          <w:tcPr>
+            <w:tcW w:type="dxa" w:w="864"/>
+          </w:tcPr>
+          <w:p>
+            <w:r>
+              <w:t>2</w:t>
             </w:r>
           </w:p>
         </w:tc>
@@ -2012,67 +2012,67 @@
           </w:tcPr>
           <w:p>
             <w:r>
+              <w:t>198</w:t>
+            </w:r>
+          </w:p>
+        </w:tc>
+        <w:tc>
+          <w:tcPr>
+            <w:tcW w:type="dxa" w:w="864"/>
+          </w:tcPr>
+          <w:p>
+            <w:r>
+              <w:t>5</w:t>
+            </w:r>
+          </w:p>
+        </w:tc>
+        <w:tc>
+          <w:tcPr>
+            <w:tcW w:type="dxa" w:w="864"/>
+          </w:tcPr>
+          <w:p>
+            <w:r>
+              <w:t>1</w:t>
+            </w:r>
+          </w:p>
+        </w:tc>
+        <w:tc>
+          <w:tcPr>
+            <w:tcW w:type="dxa" w:w="864"/>
+          </w:tcPr>
+          <w:p>
+            <w:r>
+              <w:t>14.000</w:t>
+            </w:r>
+          </w:p>
+        </w:tc>
+        <w:tc>
+          <w:tcPr>
+            <w:tcW w:type="dxa" w:w="864"/>
+          </w:tcPr>
+          <w:p>
+            <w:r>
+              <w:t>20.000</w:t>
+            </w:r>
+          </w:p>
+        </w:tc>
+        <w:tc>
+          <w:tcPr>
+            <w:tcW w:type="dxa" w:w="864"/>
+          </w:tcPr>
+          <w:p>
+            <w:r>
+              <w:t>5</w:t>
+            </w:r>
+          </w:p>
+        </w:tc>
+        <w:tc>
+          <w:tcPr>
+            <w:tcW w:type="dxa" w:w="864"/>
+          </w:tcPr>
+          <w:p>
+            <w:r>
               <w:t>0</w:t>
-            </w:r>
-          </w:p>
-        </w:tc>
-        <w:tc>
-          <w:tcPr>
-            <w:tcW w:type="dxa" w:w="864"/>
-          </w:tcPr>
-          <w:p>
-            <w:r>
-              <w:t>5</w:t>
-            </w:r>
-          </w:p>
-        </w:tc>
-        <w:tc>
-          <w:tcPr>
-            <w:tcW w:type="dxa" w:w="864"/>
-          </w:tcPr>
-          <w:p>
-            <w:r>
-              <w:t>1</w:t>
-            </w:r>
-          </w:p>
-        </w:tc>
-        <w:tc>
-          <w:tcPr>
-            <w:tcW w:type="dxa" w:w="864"/>
-          </w:tcPr>
-          <w:p>
-            <w:r>
-              <w:t>21.054</w:t>
-            </w:r>
-          </w:p>
-        </w:tc>
-        <w:tc>
-          <w:tcPr>
-            <w:tcW w:type="dxa" w:w="864"/>
-          </w:tcPr>
-          <w:p>
-            <w:r>
-              <w:t>20.000</w:t>
-            </w:r>
-          </w:p>
-        </w:tc>
-        <w:tc>
-          <w:tcPr>
-            <w:tcW w:type="dxa" w:w="864"/>
-          </w:tcPr>
-          <w:p>
-            <w:r>
-              <w:t>203</w:t>
-            </w:r>
-          </w:p>
-        </w:tc>
-        <w:tc>
-          <w:tcPr>
-            <w:tcW w:type="dxa" w:w="864"/>
-          </w:tcPr>
-          <w:p>
-            <w:r>
-              <w:t>6</w:t>
             </w:r>
           </w:p>
         </w:tc>
@@ -2114,7 +2114,7 @@
           </w:tcPr>
           <w:p>
             <w:r>
-              <w:t>0</w:t>
+              <w:t>153</w:t>
             </w:r>
           </w:p>
         </w:tc>
@@ -2144,37 +2144,37 @@
           </w:tcPr>
           <w:p>
             <w:r>
-              <w:t>40.732</w:t>
-            </w:r>
-          </w:p>
-        </w:tc>
-        <w:tc>
-          <w:tcPr>
-            <w:tcW w:type="dxa" w:w="864"/>
-          </w:tcPr>
-          <w:p>
-            <w:r>
-              <w:t>20.000</w:t>
-            </w:r>
-          </w:p>
-        </w:tc>
-        <w:tc>
-          <w:tcPr>
-            <w:tcW w:type="dxa" w:w="864"/>
-          </w:tcPr>
-          <w:p>
-            <w:r>
-              <w:t>157</w:t>
-            </w:r>
-          </w:p>
-        </w:tc>
-        <w:tc>
-          <w:tcPr>
-            <w:tcW w:type="dxa" w:w="864"/>
-          </w:tcPr>
-          <w:p>
-            <w:r>
-              <w:t>52</w:t>
+              <w:t>83.750</w:t>
+            </w:r>
+          </w:p>
+        </w:tc>
+        <w:tc>
+          <w:tcPr>
+            <w:tcW w:type="dxa" w:w="864"/>
+          </w:tcPr>
+          <w:p>
+            <w:r>
+              <w:t>82.500</w:t>
+            </w:r>
+          </w:p>
+        </w:tc>
+        <w:tc>
+          <w:tcPr>
+            <w:tcW w:type="dxa" w:w="864"/>
+          </w:tcPr>
+          <w:p>
+            <w:r>
+              <w:t>4</w:t>
+            </w:r>
+          </w:p>
+        </w:tc>
+        <w:tc>
+          <w:tcPr>
+            <w:tcW w:type="dxa" w:w="864"/>
+          </w:tcPr>
+          <w:p>
+            <w:r>
+              <w:t>4</w:t>
             </w:r>
           </w:p>
         </w:tc>
@@ -2216,7 +2216,7 @@
           </w:tcPr>
           <w:p>
             <w:r>
-              <w:t>0</w:t>
+              <w:t>112</w:t>
             </w:r>
           </w:p>
         </w:tc>
@@ -2246,16 +2246,6 @@
           </w:tcPr>
           <w:p>
             <w:r>
-              <w:t>64.300</w:t>
-            </w:r>
-          </w:p>
-        </w:tc>
-        <w:tc>
-          <w:tcPr>
-            <w:tcW w:type="dxa" w:w="864"/>
-          </w:tcPr>
-          <w:p>
-            <w:r>
               <w:t>80.000</w:t>
             </w:r>
           </w:p>
@@ -2266,17 +2256,27 @@
           </w:tcPr>
           <w:p>
             <w:r>
-              <w:t>230</w:t>
-            </w:r>
-          </w:p>
-        </w:tc>
-        <w:tc>
-          <w:tcPr>
-            <w:tcW w:type="dxa" w:w="864"/>
-          </w:tcPr>
-          <w:p>
-            <w:r>
-              <w:t>169</w:t>
+              <w:t>80.000</w:t>
+            </w:r>
+          </w:p>
+        </w:tc>
+        <w:tc>
+          <w:tcPr>
+            <w:tcW w:type="dxa" w:w="864"/>
+          </w:tcPr>
+          <w:p>
+            <w:r>
+              <w:t>6</w:t>
+            </w:r>
+          </w:p>
+        </w:tc>
+        <w:tc>
+          <w:tcPr>
+            <w:tcW w:type="dxa" w:w="864"/>
+          </w:tcPr>
+          <w:p>
+            <w:r>
+              <w:t>6</w:t>
             </w:r>
           </w:p>
         </w:tc>
@@ -2318,67 +2318,67 @@
           </w:tcPr>
           <w:p>
             <w:r>
+              <w:t>127</w:t>
+            </w:r>
+          </w:p>
+        </w:tc>
+        <w:tc>
+          <w:tcPr>
+            <w:tcW w:type="dxa" w:w="864"/>
+          </w:tcPr>
+          <w:p>
+            <w:r>
+              <w:t>3</w:t>
+            </w:r>
+          </w:p>
+        </w:tc>
+        <w:tc>
+          <w:tcPr>
+            <w:tcW w:type="dxa" w:w="864"/>
+          </w:tcPr>
+          <w:p>
+            <w:r>
+              <w:t>1</w:t>
+            </w:r>
+          </w:p>
+        </w:tc>
+        <w:tc>
+          <w:tcPr>
+            <w:tcW w:type="dxa" w:w="864"/>
+          </w:tcPr>
+          <w:p>
+            <w:r>
+              <w:t>18.333</w:t>
+            </w:r>
+          </w:p>
+        </w:tc>
+        <w:tc>
+          <w:tcPr>
+            <w:tcW w:type="dxa" w:w="864"/>
+          </w:tcPr>
+          <w:p>
+            <w:r>
+              <w:t>20.000</w:t>
+            </w:r>
+          </w:p>
+        </w:tc>
+        <w:tc>
+          <w:tcPr>
+            <w:tcW w:type="dxa" w:w="864"/>
+          </w:tcPr>
+          <w:p>
+            <w:r>
+              <w:t>6</w:t>
+            </w:r>
+          </w:p>
+        </w:tc>
+        <w:tc>
+          <w:tcPr>
+            <w:tcW w:type="dxa" w:w="864"/>
+          </w:tcPr>
+          <w:p>
+            <w:r>
               <w:t>0</w:t>
-            </w:r>
-          </w:p>
-        </w:tc>
-        <w:tc>
-          <w:tcPr>
-            <w:tcW w:type="dxa" w:w="864"/>
-          </w:tcPr>
-          <w:p>
-            <w:r>
-              <w:t>3</w:t>
-            </w:r>
-          </w:p>
-        </w:tc>
-        <w:tc>
-          <w:tcPr>
-            <w:tcW w:type="dxa" w:w="864"/>
-          </w:tcPr>
-          <w:p>
-            <w:r>
-              <w:t>1</w:t>
-            </w:r>
-          </w:p>
-        </w:tc>
-        <w:tc>
-          <w:tcPr>
-            <w:tcW w:type="dxa" w:w="864"/>
-          </w:tcPr>
-          <w:p>
-            <w:r>
-              <w:t>34.404</w:t>
-            </w:r>
-          </w:p>
-        </w:tc>
-        <w:tc>
-          <w:tcPr>
-            <w:tcW w:type="dxa" w:w="864"/>
-          </w:tcPr>
-          <w:p>
-            <w:r>
-              <w:t>20.000</w:t>
-            </w:r>
-          </w:p>
-        </w:tc>
-        <w:tc>
-          <w:tcPr>
-            <w:tcW w:type="dxa" w:w="864"/>
-          </w:tcPr>
-          <w:p>
-            <w:r>
-              <w:t>260</w:t>
-            </w:r>
-          </w:p>
-        </w:tc>
-        <w:tc>
-          <w:tcPr>
-            <w:tcW w:type="dxa" w:w="864"/>
-          </w:tcPr>
-          <w:p>
-            <w:r>
-              <w:t>76</w:t>
             </w:r>
           </w:p>
         </w:tc>
@@ -2420,7 +2420,7 @@
           </w:tcPr>
           <w:p>
             <w:r>
-              <w:t>0</w:t>
+              <w:t>154</w:t>
             </w:r>
           </w:p>
         </w:tc>
@@ -2450,37 +2450,37 @@
           </w:tcPr>
           <w:p>
             <w:r>
-              <w:t>62.368</w:t>
-            </w:r>
-          </w:p>
-        </w:tc>
-        <w:tc>
-          <w:tcPr>
-            <w:tcW w:type="dxa" w:w="864"/>
-          </w:tcPr>
-          <w:p>
-            <w:r>
-              <w:t>80.000</w:t>
-            </w:r>
-          </w:p>
-        </w:tc>
-        <w:tc>
-          <w:tcPr>
-            <w:tcW w:type="dxa" w:w="864"/>
-          </w:tcPr>
-          <w:p>
-            <w:r>
-              <w:t>465</w:t>
-            </w:r>
-          </w:p>
-        </w:tc>
-        <w:tc>
-          <w:tcPr>
-            <w:tcW w:type="dxa" w:w="864"/>
-          </w:tcPr>
-          <w:p>
-            <w:r>
-              <w:t>311</w:t>
+              <w:t>85.000</w:t>
+            </w:r>
+          </w:p>
+        </w:tc>
+        <w:tc>
+          <w:tcPr>
+            <w:tcW w:type="dxa" w:w="864"/>
+          </w:tcPr>
+          <w:p>
+            <w:r>
+              <w:t>85.000</w:t>
+            </w:r>
+          </w:p>
+        </w:tc>
+        <w:tc>
+          <w:tcPr>
+            <w:tcW w:type="dxa" w:w="864"/>
+          </w:tcPr>
+          <w:p>
+            <w:r>
+              <w:t>3</w:t>
+            </w:r>
+          </w:p>
+        </w:tc>
+        <w:tc>
+          <w:tcPr>
+            <w:tcW w:type="dxa" w:w="864"/>
+          </w:tcPr>
+          <w:p>
+            <w:r>
+              <w:t>3</w:t>
             </w:r>
           </w:p>
         </w:tc>
@@ -2522,67 +2522,67 @@
           </w:tcPr>
           <w:p>
             <w:r>
+              <w:t>378</w:t>
+            </w:r>
+          </w:p>
+        </w:tc>
+        <w:tc>
+          <w:tcPr>
+            <w:tcW w:type="dxa" w:w="864"/>
+          </w:tcPr>
+          <w:p>
+            <w:r>
+              <w:t>5</w:t>
+            </w:r>
+          </w:p>
+        </w:tc>
+        <w:tc>
+          <w:tcPr>
+            <w:tcW w:type="dxa" w:w="864"/>
+          </w:tcPr>
+          <w:p>
+            <w:r>
+              <w:t>1</w:t>
+            </w:r>
+          </w:p>
+        </w:tc>
+        <w:tc>
+          <w:tcPr>
+            <w:tcW w:type="dxa" w:w="864"/>
+          </w:tcPr>
+          <w:p>
+            <w:r>
+              <w:t>12.000</w:t>
+            </w:r>
+          </w:p>
+        </w:tc>
+        <w:tc>
+          <w:tcPr>
+            <w:tcW w:type="dxa" w:w="864"/>
+          </w:tcPr>
+          <w:p>
+            <w:r>
+              <w:t>20.000</w:t>
+            </w:r>
+          </w:p>
+        </w:tc>
+        <w:tc>
+          <w:tcPr>
+            <w:tcW w:type="dxa" w:w="864"/>
+          </w:tcPr>
+          <w:p>
+            <w:r>
+              <w:t>5</w:t>
+            </w:r>
+          </w:p>
+        </w:tc>
+        <w:tc>
+          <w:tcPr>
+            <w:tcW w:type="dxa" w:w="864"/>
+          </w:tcPr>
+          <w:p>
+            <w:r>
               <w:t>0</w:t>
-            </w:r>
-          </w:p>
-        </w:tc>
-        <w:tc>
-          <w:tcPr>
-            <w:tcW w:type="dxa" w:w="864"/>
-          </w:tcPr>
-          <w:p>
-            <w:r>
-              <w:t>5</w:t>
-            </w:r>
-          </w:p>
-        </w:tc>
-        <w:tc>
-          <w:tcPr>
-            <w:tcW w:type="dxa" w:w="864"/>
-          </w:tcPr>
-          <w:p>
-            <w:r>
-              <w:t>1</w:t>
-            </w:r>
-          </w:p>
-        </w:tc>
-        <w:tc>
-          <w:tcPr>
-            <w:tcW w:type="dxa" w:w="864"/>
-          </w:tcPr>
-          <w:p>
-            <w:r>
-              <w:t>24.352</w:t>
-            </w:r>
-          </w:p>
-        </w:tc>
-        <w:tc>
-          <w:tcPr>
-            <w:tcW w:type="dxa" w:w="864"/>
-          </w:tcPr>
-          <w:p>
-            <w:r>
-              <w:t>20.000</w:t>
-            </w:r>
-          </w:p>
-        </w:tc>
-        <w:tc>
-          <w:tcPr>
-            <w:tcW w:type="dxa" w:w="864"/>
-          </w:tcPr>
-          <w:p>
-            <w:r>
-              <w:t>383</w:t>
-            </w:r>
-          </w:p>
-        </w:tc>
-        <w:tc>
-          <w:tcPr>
-            <w:tcW w:type="dxa" w:w="864"/>
-          </w:tcPr>
-          <w:p>
-            <w:r>
-              <w:t>39</w:t>
             </w:r>
           </w:p>
         </w:tc>
@@ -2624,7 +2624,7 @@
           </w:tcPr>
           <w:p>
             <w:r>
-              <w:t>0</w:t>
+              <w:t>44</w:t>
             </w:r>
           </w:p>
         </w:tc>
@@ -2654,37 +2654,37 @@
           </w:tcPr>
           <w:p>
             <w:r>
-              <w:t>58.558</w:t>
-            </w:r>
-          </w:p>
-        </w:tc>
-        <w:tc>
-          <w:tcPr>
-            <w:tcW w:type="dxa" w:w="864"/>
-          </w:tcPr>
-          <w:p>
-            <w:r>
-              <w:t>80.000</w:t>
-            </w:r>
-          </w:p>
-        </w:tc>
-        <w:tc>
-          <w:tcPr>
-            <w:tcW w:type="dxa" w:w="864"/>
-          </w:tcPr>
-          <w:p>
-            <w:r>
-              <w:t>52</w:t>
-            </w:r>
-          </w:p>
-        </w:tc>
-        <w:tc>
-          <w:tcPr>
-            <w:tcW w:type="dxa" w:w="864"/>
-          </w:tcPr>
-          <w:p>
-            <w:r>
-              <w:t>34</w:t>
+              <w:t>36.250</w:t>
+            </w:r>
+          </w:p>
+        </w:tc>
+        <w:tc>
+          <w:tcPr>
+            <w:tcW w:type="dxa" w:w="864"/>
+          </w:tcPr>
+          <w:p>
+            <w:r>
+              <w:t>20.000</w:t>
+            </w:r>
+          </w:p>
+        </w:tc>
+        <w:tc>
+          <w:tcPr>
+            <w:tcW w:type="dxa" w:w="864"/>
+          </w:tcPr>
+          <w:p>
+            <w:r>
+              <w:t>8</w:t>
+            </w:r>
+          </w:p>
+        </w:tc>
+        <w:tc>
+          <w:tcPr>
+            <w:tcW w:type="dxa" w:w="864"/>
+          </w:tcPr>
+          <w:p>
+            <w:r>
+              <w:t>3</w:t>
             </w:r>
           </w:p>
         </w:tc>
@@ -2726,7 +2726,7 @@
           </w:tcPr>
           <w:p>
             <w:r>
-              <w:t>0</w:t>
+              <w:t>285</w:t>
             </w:r>
           </w:p>
         </w:tc>
@@ -2756,37 +2756,37 @@
           </w:tcPr>
           <w:p>
             <w:r>
-              <w:t>71.703</w:t>
-            </w:r>
-          </w:p>
-        </w:tc>
-        <w:tc>
-          <w:tcPr>
-            <w:tcW w:type="dxa" w:w="864"/>
-          </w:tcPr>
-          <w:p>
-            <w:r>
-              <w:t>80.000</w:t>
-            </w:r>
-          </w:p>
-        </w:tc>
-        <w:tc>
-          <w:tcPr>
-            <w:tcW w:type="dxa" w:w="864"/>
-          </w:tcPr>
-          <w:p>
-            <w:r>
-              <w:t>1740</w:t>
-            </w:r>
-          </w:p>
-        </w:tc>
-        <w:tc>
-          <w:tcPr>
-            <w:tcW w:type="dxa" w:w="864"/>
-          </w:tcPr>
-          <w:p>
-            <w:r>
-              <w:t>1399</w:t>
+              <w:t>34.667</w:t>
+            </w:r>
+          </w:p>
+        </w:tc>
+        <w:tc>
+          <w:tcPr>
+            <w:tcW w:type="dxa" w:w="864"/>
+          </w:tcPr>
+          <w:p>
+            <w:r>
+              <w:t>20.000</w:t>
+            </w:r>
+          </w:p>
+        </w:tc>
+        <w:tc>
+          <w:tcPr>
+            <w:tcW w:type="dxa" w:w="864"/>
+          </w:tcPr>
+          <w:p>
+            <w:r>
+              <w:t>30</w:t>
+            </w:r>
+          </w:p>
+        </w:tc>
+        <w:tc>
+          <w:tcPr>
+            <w:tcW w:type="dxa" w:w="864"/>
+          </w:tcPr>
+          <w:p>
+            <w:r>
+              <w:t>9</w:t>
             </w:r>
           </w:p>
         </w:tc>
@@ -2828,67 +2828,67 @@
           </w:tcPr>
           <w:p>
             <w:r>
+              <w:t>232</w:t>
+            </w:r>
+          </w:p>
+        </w:tc>
+        <w:tc>
+          <w:tcPr>
+            <w:tcW w:type="dxa" w:w="864"/>
+          </w:tcPr>
+          <w:p>
+            <w:r>
+              <w:t>1</w:t>
+            </w:r>
+          </w:p>
+        </w:tc>
+        <w:tc>
+          <w:tcPr>
+            <w:tcW w:type="dxa" w:w="864"/>
+          </w:tcPr>
+          <w:p>
+            <w:r>
+              <w:t>1</w:t>
+            </w:r>
+          </w:p>
+        </w:tc>
+        <w:tc>
+          <w:tcPr>
+            <w:tcW w:type="dxa" w:w="864"/>
+          </w:tcPr>
+          <w:p>
+            <w:r>
+              <w:t>20.000</w:t>
+            </w:r>
+          </w:p>
+        </w:tc>
+        <w:tc>
+          <w:tcPr>
+            <w:tcW w:type="dxa" w:w="864"/>
+          </w:tcPr>
+          <w:p>
+            <w:r>
+              <w:t>20.000</w:t>
+            </w:r>
+          </w:p>
+        </w:tc>
+        <w:tc>
+          <w:tcPr>
+            <w:tcW w:type="dxa" w:w="864"/>
+          </w:tcPr>
+          <w:p>
+            <w:r>
+              <w:t>1</w:t>
+            </w:r>
+          </w:p>
+        </w:tc>
+        <w:tc>
+          <w:tcPr>
+            <w:tcW w:type="dxa" w:w="864"/>
+          </w:tcPr>
+          <w:p>
+            <w:r>
               <w:t>0</w:t>
-            </w:r>
-          </w:p>
-        </w:tc>
-        <w:tc>
-          <w:tcPr>
-            <w:tcW w:type="dxa" w:w="864"/>
-          </w:tcPr>
-          <w:p>
-            <w:r>
-              <w:t>1</w:t>
-            </w:r>
-          </w:p>
-        </w:tc>
-        <w:tc>
-          <w:tcPr>
-            <w:tcW w:type="dxa" w:w="864"/>
-          </w:tcPr>
-          <w:p>
-            <w:r>
-              <w:t>1</w:t>
-            </w:r>
-          </w:p>
-        </w:tc>
-        <w:tc>
-          <w:tcPr>
-            <w:tcW w:type="dxa" w:w="864"/>
-          </w:tcPr>
-          <w:p>
-            <w:r>
-              <w:t>47.086</w:t>
-            </w:r>
-          </w:p>
-        </w:tc>
-        <w:tc>
-          <w:tcPr>
-            <w:tcW w:type="dxa" w:w="864"/>
-          </w:tcPr>
-          <w:p>
-            <w:r>
-              <w:t>20.000</w:t>
-            </w:r>
-          </w:p>
-        </w:tc>
-        <w:tc>
-          <w:tcPr>
-            <w:tcW w:type="dxa" w:w="864"/>
-          </w:tcPr>
-          <w:p>
-            <w:r>
-              <w:t>233</w:t>
-            </w:r>
-          </w:p>
-        </w:tc>
-        <w:tc>
-          <w:tcPr>
-            <w:tcW w:type="dxa" w:w="864"/>
-          </w:tcPr>
-          <w:p>
-            <w:r>
-              <w:t>104</w:t>
             </w:r>
           </w:p>
         </w:tc>
@@ -2930,7 +2930,7 @@
           </w:tcPr>
           <w:p>
             <w:r>
-              <w:t>0</w:t>
+              <w:t>201</w:t>
             </w:r>
           </w:p>
         </w:tc>
@@ -2960,37 +2960,37 @@
           </w:tcPr>
           <w:p>
             <w:r>
-              <w:t>74.725</w:t>
-            </w:r>
-          </w:p>
-        </w:tc>
-        <w:tc>
-          <w:tcPr>
-            <w:tcW w:type="dxa" w:w="864"/>
-          </w:tcPr>
-          <w:p>
-            <w:r>
-              <w:t>85.000</w:t>
-            </w:r>
-          </w:p>
-        </w:tc>
-        <w:tc>
-          <w:tcPr>
-            <w:tcW w:type="dxa" w:w="864"/>
-          </w:tcPr>
-          <w:p>
-            <w:r>
-              <w:t>207</w:t>
-            </w:r>
-          </w:p>
-        </w:tc>
-        <w:tc>
-          <w:tcPr>
-            <w:tcW w:type="dxa" w:w="864"/>
-          </w:tcPr>
-          <w:p>
-            <w:r>
-              <w:t>171</w:t>
+              <w:t>60.833</w:t>
+            </w:r>
+          </w:p>
+        </w:tc>
+        <w:tc>
+          <w:tcPr>
+            <w:tcW w:type="dxa" w:w="864"/>
+          </w:tcPr>
+          <w:p>
+            <w:r>
+              <w:t>80.000</w:t>
+            </w:r>
+          </w:p>
+        </w:tc>
+        <w:tc>
+          <w:tcPr>
+            <w:tcW w:type="dxa" w:w="864"/>
+          </w:tcPr>
+          <w:p>
+            <w:r>
+              <w:t>6</w:t>
+            </w:r>
+          </w:p>
+        </w:tc>
+        <w:tc>
+          <w:tcPr>
+            <w:tcW w:type="dxa" w:w="864"/>
+          </w:tcPr>
+          <w:p>
+            <w:r>
+              <w:t>4</w:t>
             </w:r>
           </w:p>
         </w:tc>
@@ -3032,7 +3032,7 @@
           </w:tcPr>
           <w:p>
             <w:r>
-              <w:t>0</w:t>
+              <w:t>224</w:t>
             </w:r>
           </w:p>
         </w:tc>
@@ -3062,37 +3062,37 @@
           </w:tcPr>
           <w:p>
             <w:r>
-              <w:t>30.317</w:t>
-            </w:r>
-          </w:p>
-        </w:tc>
-        <w:tc>
-          <w:tcPr>
-            <w:tcW w:type="dxa" w:w="864"/>
-          </w:tcPr>
-          <w:p>
-            <w:r>
-              <w:t>20.000</w:t>
-            </w:r>
-          </w:p>
-        </w:tc>
-        <w:tc>
-          <w:tcPr>
-            <w:tcW w:type="dxa" w:w="864"/>
-          </w:tcPr>
-          <w:p>
-            <w:r>
-              <w:t>227</w:t>
-            </w:r>
-          </w:p>
-        </w:tc>
-        <w:tc>
-          <w:tcPr>
-            <w:tcW w:type="dxa" w:w="864"/>
-          </w:tcPr>
-          <w:p>
-            <w:r>
-              <w:t>47</w:t>
+              <w:t>80.000</w:t>
+            </w:r>
+          </w:p>
+        </w:tc>
+        <w:tc>
+          <w:tcPr>
+            <w:tcW w:type="dxa" w:w="864"/>
+          </w:tcPr>
+          <w:p>
+            <w:r>
+              <w:t>80.000</w:t>
+            </w:r>
+          </w:p>
+        </w:tc>
+        <w:tc>
+          <w:tcPr>
+            <w:tcW w:type="dxa" w:w="864"/>
+          </w:tcPr>
+          <w:p>
+            <w:r>
+              <w:t>3</w:t>
+            </w:r>
+          </w:p>
+        </w:tc>
+        <w:tc>
+          <w:tcPr>
+            <w:tcW w:type="dxa" w:w="864"/>
+          </w:tcPr>
+          <w:p>
+            <w:r>
+              <w:t>3</w:t>
             </w:r>
           </w:p>
         </w:tc>
@@ -3134,7 +3134,7 @@
           </w:tcPr>
           <w:p>
             <w:r>
-              <w:t>0</w:t>
+              <w:t>1266</w:t>
             </w:r>
           </w:p>
         </w:tc>
@@ -3164,37 +3164,37 @@
           </w:tcPr>
           <w:p>
             <w:r>
-              <w:t>49.048</w:t>
-            </w:r>
-          </w:p>
-        </w:tc>
-        <w:tc>
-          <w:tcPr>
-            <w:tcW w:type="dxa" w:w="864"/>
-          </w:tcPr>
-          <w:p>
-            <w:r>
-              <w:t>30.000</w:t>
-            </w:r>
-          </w:p>
-        </w:tc>
-        <w:tc>
-          <w:tcPr>
-            <w:tcW w:type="dxa" w:w="864"/>
-          </w:tcPr>
-          <w:p>
-            <w:r>
-              <w:t>3807</w:t>
-            </w:r>
-          </w:p>
-        </w:tc>
-        <w:tc>
-          <w:tcPr>
-            <w:tcW w:type="dxa" w:w="864"/>
-          </w:tcPr>
-          <w:p>
-            <w:r>
-              <w:t>1857</w:t>
+              <w:t>51.111</w:t>
+            </w:r>
+          </w:p>
+        </w:tc>
+        <w:tc>
+          <w:tcPr>
+            <w:tcW w:type="dxa" w:w="864"/>
+          </w:tcPr>
+          <w:p>
+            <w:r>
+              <w:t>20.000</w:t>
+            </w:r>
+          </w:p>
+        </w:tc>
+        <w:tc>
+          <w:tcPr>
+            <w:tcW w:type="dxa" w:w="864"/>
+          </w:tcPr>
+          <w:p>
+            <w:r>
+              <w:t>9</w:t>
+            </w:r>
+          </w:p>
+        </w:tc>
+        <w:tc>
+          <w:tcPr>
+            <w:tcW w:type="dxa" w:w="864"/>
+          </w:tcPr>
+          <w:p>
+            <w:r>
+              <w:t>4</w:t>
             </w:r>
           </w:p>
         </w:tc>
@@ -3236,7 +3236,7 @@
           </w:tcPr>
           <w:p>
             <w:r>
-              <w:t>0</w:t>
+              <w:t>260</w:t>
             </w:r>
           </w:p>
         </w:tc>
@@ -3266,37 +3266,37 @@
           </w:tcPr>
           <w:p>
             <w:r>
-              <w:t>80.887</w:t>
-            </w:r>
-          </w:p>
-        </w:tc>
-        <w:tc>
-          <w:tcPr>
-            <w:tcW w:type="dxa" w:w="864"/>
-          </w:tcPr>
-          <w:p>
-            <w:r>
-              <w:t>80.000</w:t>
-            </w:r>
-          </w:p>
-        </w:tc>
-        <w:tc>
-          <w:tcPr>
-            <w:tcW w:type="dxa" w:w="864"/>
-          </w:tcPr>
-          <w:p>
-            <w:r>
-              <w:t>265</w:t>
-            </w:r>
-          </w:p>
-        </w:tc>
-        <w:tc>
-          <w:tcPr>
-            <w:tcW w:type="dxa" w:w="864"/>
-          </w:tcPr>
-          <w:p>
-            <w:r>
-              <w:t>259</w:t>
+              <w:t>26.000</w:t>
+            </w:r>
+          </w:p>
+        </w:tc>
+        <w:tc>
+          <w:tcPr>
+            <w:tcW w:type="dxa" w:w="864"/>
+          </w:tcPr>
+          <w:p>
+            <w:r>
+              <w:t>20.000</w:t>
+            </w:r>
+          </w:p>
+        </w:tc>
+        <w:tc>
+          <w:tcPr>
+            <w:tcW w:type="dxa" w:w="864"/>
+          </w:tcPr>
+          <w:p>
+            <w:r>
+              <w:t>5</w:t>
+            </w:r>
+          </w:p>
+        </w:tc>
+        <w:tc>
+          <w:tcPr>
+            <w:tcW w:type="dxa" w:w="864"/>
+          </w:tcPr>
+          <w:p>
+            <w:r>
+              <w:t>1</w:t>
             </w:r>
           </w:p>
         </w:tc>
@@ -3338,7 +3338,7 @@
           </w:tcPr>
           <w:p>
             <w:r>
-              <w:t>0</w:t>
+              <w:t>1773</w:t>
             </w:r>
           </w:p>
         </w:tc>
@@ -3368,7 +3368,7 @@
           </w:tcPr>
           <w:p>
             <w:r>
-              <w:t>77.181</w:t>
+              <w:t>87.500</w:t>
             </w:r>
           </w:p>
         </w:tc>
@@ -3388,17 +3388,17 @@
           </w:tcPr>
           <w:p>
             <w:r>
-              <w:t>3568</w:t>
-            </w:r>
-          </w:p>
-        </w:tc>
-        <w:tc>
-          <w:tcPr>
-            <w:tcW w:type="dxa" w:w="864"/>
-          </w:tcPr>
-          <w:p>
-            <w:r>
-              <w:t>2977</w:t>
+              <w:t>22</w:t>
+            </w:r>
+          </w:p>
+        </w:tc>
+        <w:tc>
+          <w:tcPr>
+            <w:tcW w:type="dxa" w:w="864"/>
+          </w:tcPr>
+          <w:p>
+            <w:r>
+              <w:t>22</w:t>
             </w:r>
           </w:p>
         </w:tc>
@@ -3440,7 +3440,7 @@
           </w:tcPr>
           <w:p>
             <w:r>
-              <w:t>0</w:t>
+              <w:t>385</w:t>
             </w:r>
           </w:p>
         </w:tc>
@@ -3470,37 +3470,37 @@
           </w:tcPr>
           <w:p>
             <w:r>
-              <w:t>65.191</w:t>
-            </w:r>
-          </w:p>
-        </w:tc>
-        <w:tc>
-          <w:tcPr>
-            <w:tcW w:type="dxa" w:w="864"/>
-          </w:tcPr>
-          <w:p>
-            <w:r>
-              <w:t>85.000</w:t>
-            </w:r>
-          </w:p>
-        </w:tc>
-        <w:tc>
-          <w:tcPr>
-            <w:tcW w:type="dxa" w:w="864"/>
-          </w:tcPr>
-          <w:p>
-            <w:r>
-              <w:t>776</w:t>
-            </w:r>
-          </w:p>
-        </w:tc>
-        <w:tc>
-          <w:tcPr>
-            <w:tcW w:type="dxa" w:w="864"/>
-          </w:tcPr>
-          <w:p>
-            <w:r>
-              <w:t>550</w:t>
+              <w:t>38.333</w:t>
+            </w:r>
+          </w:p>
+        </w:tc>
+        <w:tc>
+          <w:tcPr>
+            <w:tcW w:type="dxa" w:w="864"/>
+          </w:tcPr>
+          <w:p>
+            <w:r>
+              <w:t>20.000</w:t>
+            </w:r>
+          </w:p>
+        </w:tc>
+        <w:tc>
+          <w:tcPr>
+            <w:tcW w:type="dxa" w:w="864"/>
+          </w:tcPr>
+          <w:p>
+            <w:r>
+              <w:t>6</w:t>
+            </w:r>
+          </w:p>
+        </w:tc>
+        <w:tc>
+          <w:tcPr>
+            <w:tcW w:type="dxa" w:w="864"/>
+          </w:tcPr>
+          <w:p>
+            <w:r>
+              <w:t>2</w:t>
             </w:r>
           </w:p>
         </w:tc>
@@ -3542,7 +3542,7 @@
           </w:tcPr>
           <w:p>
             <w:r>
-              <w:t>0</w:t>
+              <w:t>223</w:t>
             </w:r>
           </w:p>
         </w:tc>
@@ -3572,7 +3572,7 @@
           </w:tcPr>
           <w:p>
             <w:r>
-              <w:t>66.760</w:t>
+              <w:t>59.167</w:t>
             </w:r>
           </w:p>
         </w:tc>
@@ -3592,17 +3592,17 @@
           </w:tcPr>
           <w:p>
             <w:r>
-              <w:t>458</w:t>
-            </w:r>
-          </w:p>
-        </w:tc>
-        <w:tc>
-          <w:tcPr>
-            <w:tcW w:type="dxa" w:w="864"/>
-          </w:tcPr>
-          <w:p>
-            <w:r>
-              <w:t>343</w:t>
+              <w:t>12</w:t>
+            </w:r>
+          </w:p>
+        </w:tc>
+        <w:tc>
+          <w:tcPr>
+            <w:tcW w:type="dxa" w:w="864"/>
+          </w:tcPr>
+          <w:p>
+            <w:r>
+              <w:t>8</w:t>
             </w:r>
           </w:p>
         </w:tc>
@@ -3644,6 +3644,16 @@
           </w:tcPr>
           <w:p>
             <w:r>
+              <w:t>73</w:t>
+            </w:r>
+          </w:p>
+        </w:tc>
+        <w:tc>
+          <w:tcPr>
+            <w:tcW w:type="dxa" w:w="864"/>
+          </w:tcPr>
+          <w:p>
+            <w:r>
               <w:t>0</w:t>
             </w:r>
           </w:p>
@@ -3664,47 +3674,37 @@
           </w:tcPr>
           <w:p>
             <w:r>
-              <w:t>1</w:t>
-            </w:r>
-          </w:p>
-        </w:tc>
-        <w:tc>
-          <w:tcPr>
-            <w:tcW w:type="dxa" w:w="864"/>
-          </w:tcPr>
-          <w:p>
-            <w:r>
-              <w:t>39.027</w:t>
-            </w:r>
-          </w:p>
-        </w:tc>
-        <w:tc>
-          <w:tcPr>
-            <w:tcW w:type="dxa" w:w="864"/>
-          </w:tcPr>
-          <w:p>
-            <w:r>
-              <w:t>20.000</w:t>
-            </w:r>
-          </w:p>
-        </w:tc>
-        <w:tc>
-          <w:tcPr>
-            <w:tcW w:type="dxa" w:w="864"/>
-          </w:tcPr>
-          <w:p>
-            <w:r>
-              <w:t>73</w:t>
-            </w:r>
-          </w:p>
-        </w:tc>
-        <w:tc>
-          <w:tcPr>
-            <w:tcW w:type="dxa" w:w="864"/>
-          </w:tcPr>
-          <w:p>
-            <w:r>
-              <w:t>25</w:t>
+              <w:t>—</w:t>
+            </w:r>
+          </w:p>
+        </w:tc>
+        <w:tc>
+          <w:tcPr>
+            <w:tcW w:type="dxa" w:w="864"/>
+          </w:tcPr>
+          <w:p>
+            <w:r>
+              <w:t>—</w:t>
+            </w:r>
+          </w:p>
+        </w:tc>
+        <w:tc>
+          <w:tcPr>
+            <w:tcW w:type="dxa" w:w="864"/>
+          </w:tcPr>
+          <w:p>
+            <w:r>
+              <w:t>0</w:t>
+            </w:r>
+          </w:p>
+        </w:tc>
+        <w:tc>
+          <w:tcPr>
+            <w:tcW w:type="dxa" w:w="864"/>
+          </w:tcPr>
+          <w:p>
+            <w:r>
+              <w:t>0</w:t>
             </w:r>
           </w:p>
         </w:tc>
@@ -3746,7 +3746,7 @@
           </w:tcPr>
           <w:p>
             <w:r>
-              <w:t>0</w:t>
+              <w:t>354</w:t>
             </w:r>
           </w:p>
         </w:tc>
@@ -3776,7 +3776,7 @@
           </w:tcPr>
           <w:p>
             <w:r>
-              <w:t>51.737</w:t>
+              <w:t>55.000</w:t>
             </w:r>
           </w:p>
         </w:tc>
@@ -3796,17 +3796,17 @@
           </w:tcPr>
           <w:p>
             <w:r>
-              <w:t>722</w:t>
-            </w:r>
-          </w:p>
-        </w:tc>
-        <w:tc>
-          <w:tcPr>
-            <w:tcW w:type="dxa" w:w="864"/>
-          </w:tcPr>
-          <w:p>
-            <w:r>
-              <w:t>384</w:t>
+              <w:t>14</w:t>
+            </w:r>
+          </w:p>
+        </w:tc>
+        <w:tc>
+          <w:tcPr>
+            <w:tcW w:type="dxa" w:w="864"/>
+          </w:tcPr>
+          <w:p>
+            <w:r>
+              <w:t>8</w:t>
             </w:r>
           </w:p>
         </w:tc>
@@ -3848,7 +3848,7 @@
           </w:tcPr>
           <w:p>
             <w:r>
-              <w:t>0</w:t>
+              <w:t>233</w:t>
             </w:r>
           </w:p>
         </w:tc>
@@ -3878,37 +3878,37 @@
           </w:tcPr>
           <w:p>
             <w:r>
-              <w:t>56.683</w:t>
-            </w:r>
-          </w:p>
-        </w:tc>
-        <w:tc>
-          <w:tcPr>
-            <w:tcW w:type="dxa" w:w="864"/>
-          </w:tcPr>
-          <w:p>
-            <w:r>
-              <w:t>80.000</w:t>
-            </w:r>
-          </w:p>
-        </w:tc>
-        <w:tc>
-          <w:tcPr>
-            <w:tcW w:type="dxa" w:w="864"/>
-          </w:tcPr>
-          <w:p>
-            <w:r>
-              <w:t>480</w:t>
-            </w:r>
-          </w:p>
-        </w:tc>
-        <w:tc>
-          <w:tcPr>
-            <w:tcW w:type="dxa" w:w="864"/>
-          </w:tcPr>
-          <w:p>
-            <w:r>
-              <w:t>284</w:t>
+              <w:t>30.714</w:t>
+            </w:r>
+          </w:p>
+        </w:tc>
+        <w:tc>
+          <w:tcPr>
+            <w:tcW w:type="dxa" w:w="864"/>
+          </w:tcPr>
+          <w:p>
+            <w:r>
+              <w:t>20.000</w:t>
+            </w:r>
+          </w:p>
+        </w:tc>
+        <w:tc>
+          <w:tcPr>
+            <w:tcW w:type="dxa" w:w="864"/>
+          </w:tcPr>
+          <w:p>
+            <w:r>
+              <w:t>14</w:t>
+            </w:r>
+          </w:p>
+        </w:tc>
+        <w:tc>
+          <w:tcPr>
+            <w:tcW w:type="dxa" w:w="864"/>
+          </w:tcPr>
+          <w:p>
+            <w:r>
+              <w:t>3</w:t>
             </w:r>
           </w:p>
         </w:tc>
@@ -3950,67 +3950,67 @@
           </w:tcPr>
           <w:p>
             <w:r>
+              <w:t>309</w:t>
+            </w:r>
+          </w:p>
+        </w:tc>
+        <w:tc>
+          <w:tcPr>
+            <w:tcW w:type="dxa" w:w="864"/>
+          </w:tcPr>
+          <w:p>
+            <w:r>
+              <w:t>5</w:t>
+            </w:r>
+          </w:p>
+        </w:tc>
+        <w:tc>
+          <w:tcPr>
+            <w:tcW w:type="dxa" w:w="864"/>
+          </w:tcPr>
+          <w:p>
+            <w:r>
+              <w:t>1</w:t>
+            </w:r>
+          </w:p>
+        </w:tc>
+        <w:tc>
+          <w:tcPr>
+            <w:tcW w:type="dxa" w:w="864"/>
+          </w:tcPr>
+          <w:p>
+            <w:r>
+              <w:t>8.000</w:t>
+            </w:r>
+          </w:p>
+        </w:tc>
+        <w:tc>
+          <w:tcPr>
+            <w:tcW w:type="dxa" w:w="864"/>
+          </w:tcPr>
+          <w:p>
+            <w:r>
+              <w:t>0.000</w:t>
+            </w:r>
+          </w:p>
+        </w:tc>
+        <w:tc>
+          <w:tcPr>
+            <w:tcW w:type="dxa" w:w="864"/>
+          </w:tcPr>
+          <w:p>
+            <w:r>
+              <w:t>5</w:t>
+            </w:r>
+          </w:p>
+        </w:tc>
+        <w:tc>
+          <w:tcPr>
+            <w:tcW w:type="dxa" w:w="864"/>
+          </w:tcPr>
+          <w:p>
+            <w:r>
               <w:t>0</w:t>
-            </w:r>
-          </w:p>
-        </w:tc>
-        <w:tc>
-          <w:tcPr>
-            <w:tcW w:type="dxa" w:w="864"/>
-          </w:tcPr>
-          <w:p>
-            <w:r>
-              <w:t>5</w:t>
-            </w:r>
-          </w:p>
-        </w:tc>
-        <w:tc>
-          <w:tcPr>
-            <w:tcW w:type="dxa" w:w="864"/>
-          </w:tcPr>
-          <w:p>
-            <w:r>
-              <w:t>1</w:t>
-            </w:r>
-          </w:p>
-        </w:tc>
-        <w:tc>
-          <w:tcPr>
-            <w:tcW w:type="dxa" w:w="864"/>
-          </w:tcPr>
-          <w:p>
-            <w:r>
-              <w:t>50.729</w:t>
-            </w:r>
-          </w:p>
-        </w:tc>
-        <w:tc>
-          <w:tcPr>
-            <w:tcW w:type="dxa" w:w="864"/>
-          </w:tcPr>
-          <w:p>
-            <w:r>
-              <w:t>70.000</w:t>
-            </w:r>
-          </w:p>
-        </w:tc>
-        <w:tc>
-          <w:tcPr>
-            <w:tcW w:type="dxa" w:w="864"/>
-          </w:tcPr>
-          <w:p>
-            <w:r>
-              <w:t>314</w:t>
-            </w:r>
-          </w:p>
-        </w:tc>
-        <w:tc>
-          <w:tcPr>
-            <w:tcW w:type="dxa" w:w="864"/>
-          </w:tcPr>
-          <w:p>
-            <w:r>
-              <w:t>164</w:t>
             </w:r>
           </w:p>
         </w:tc>
@@ -4052,6 +4052,16 @@
           </w:tcPr>
           <w:p>
             <w:r>
+              <w:t>205</w:t>
+            </w:r>
+          </w:p>
+        </w:tc>
+        <w:tc>
+          <w:tcPr>
+            <w:tcW w:type="dxa" w:w="864"/>
+          </w:tcPr>
+          <w:p>
+            <w:r>
               <w:t>0</w:t>
             </w:r>
           </w:p>
@@ -4072,47 +4082,37 @@
           </w:tcPr>
           <w:p>
             <w:r>
-              <w:t>1</w:t>
-            </w:r>
-          </w:p>
-        </w:tc>
-        <w:tc>
-          <w:tcPr>
-            <w:tcW w:type="dxa" w:w="864"/>
-          </w:tcPr>
-          <w:p>
-            <w:r>
-              <w:t>80.566</w:t>
-            </w:r>
-          </w:p>
-        </w:tc>
-        <w:tc>
-          <w:tcPr>
-            <w:tcW w:type="dxa" w:w="864"/>
-          </w:tcPr>
-          <w:p>
-            <w:r>
-              <w:t>85.000</w:t>
-            </w:r>
-          </w:p>
-        </w:tc>
-        <w:tc>
-          <w:tcPr>
-            <w:tcW w:type="dxa" w:w="864"/>
-          </w:tcPr>
-          <w:p>
-            <w:r>
-              <w:t>205</w:t>
-            </w:r>
-          </w:p>
-        </w:tc>
-        <w:tc>
-          <w:tcPr>
-            <w:tcW w:type="dxa" w:w="864"/>
-          </w:tcPr>
-          <w:p>
-            <w:r>
-              <w:t>184</w:t>
+              <w:t>—</w:t>
+            </w:r>
+          </w:p>
+        </w:tc>
+        <w:tc>
+          <w:tcPr>
+            <w:tcW w:type="dxa" w:w="864"/>
+          </w:tcPr>
+          <w:p>
+            <w:r>
+              <w:t>—</w:t>
+            </w:r>
+          </w:p>
+        </w:tc>
+        <w:tc>
+          <w:tcPr>
+            <w:tcW w:type="dxa" w:w="864"/>
+          </w:tcPr>
+          <w:p>
+            <w:r>
+              <w:t>0</w:t>
+            </w:r>
+          </w:p>
+        </w:tc>
+        <w:tc>
+          <w:tcPr>
+            <w:tcW w:type="dxa" w:w="864"/>
+          </w:tcPr>
+          <w:p>
+            <w:r>
+              <w:t>0</w:t>
             </w:r>
           </w:p>
         </w:tc>
@@ -4154,7 +4154,7 @@
           </w:tcPr>
           <w:p>
             <w:r>
-              <w:t>0</w:t>
+              <w:t>630</w:t>
             </w:r>
           </w:p>
         </w:tc>
@@ -4184,7 +4184,7 @@
           </w:tcPr>
           <w:p>
             <w:r>
-              <w:t>54.457</w:t>
+              <w:t>71.042</w:t>
             </w:r>
           </w:p>
         </w:tc>
@@ -4204,17 +4204,17 @@
           </w:tcPr>
           <w:p>
             <w:r>
-              <w:t>3804</w:t>
-            </w:r>
-          </w:p>
-        </w:tc>
-        <w:tc>
-          <w:tcPr>
-            <w:tcW w:type="dxa" w:w="864"/>
-          </w:tcPr>
-          <w:p>
-            <w:r>
-              <w:t>2186</w:t>
+              <w:t>24</w:t>
+            </w:r>
+          </w:p>
+        </w:tc>
+        <w:tc>
+          <w:tcPr>
+            <w:tcW w:type="dxa" w:w="864"/>
+          </w:tcPr>
+          <w:p>
+            <w:r>
+              <w:t>19</w:t>
             </w:r>
           </w:p>
         </w:tc>
@@ -4256,7 +4256,7 @@
           </w:tcPr>
           <w:p>
             <w:r>
-              <w:t>0</w:t>
+              <w:t>108</w:t>
             </w:r>
           </w:p>
         </w:tc>
@@ -4286,37 +4286,37 @@
           </w:tcPr>
           <w:p>
             <w:r>
-              <w:t>15.439</w:t>
-            </w:r>
-          </w:p>
-        </w:tc>
-        <w:tc>
-          <w:tcPr>
-            <w:tcW w:type="dxa" w:w="864"/>
-          </w:tcPr>
-          <w:p>
-            <w:r>
-              <w:t>0.000</w:t>
-            </w:r>
-          </w:p>
-        </w:tc>
-        <w:tc>
-          <w:tcPr>
-            <w:tcW w:type="dxa" w:w="864"/>
-          </w:tcPr>
-          <w:p>
-            <w:r>
-              <w:t>114</w:t>
-            </w:r>
-          </w:p>
-        </w:tc>
-        <w:tc>
-          <w:tcPr>
-            <w:tcW w:type="dxa" w:w="864"/>
-          </w:tcPr>
-          <w:p>
-            <w:r>
-              <w:t>12</w:t>
+              <w:t>40.000</w:t>
+            </w:r>
+          </w:p>
+        </w:tc>
+        <w:tc>
+          <w:tcPr>
+            <w:tcW w:type="dxa" w:w="864"/>
+          </w:tcPr>
+          <w:p>
+            <w:r>
+              <w:t>20.000</w:t>
+            </w:r>
+          </w:p>
+        </w:tc>
+        <w:tc>
+          <w:tcPr>
+            <w:tcW w:type="dxa" w:w="864"/>
+          </w:tcPr>
+          <w:p>
+            <w:r>
+              <w:t>6</w:t>
+            </w:r>
+          </w:p>
+        </w:tc>
+        <w:tc>
+          <w:tcPr>
+            <w:tcW w:type="dxa" w:w="864"/>
+          </w:tcPr>
+          <w:p>
+            <w:r>
+              <w:t>2</w:t>
             </w:r>
           </w:p>
         </w:tc>
@@ -4358,7 +4358,7 @@
           </w:tcPr>
           <w:p>
             <w:r>
-              <w:t>0</w:t>
+              <w:t>94</w:t>
             </w:r>
           </w:p>
         </w:tc>
@@ -4388,37 +4388,37 @@
           </w:tcPr>
           <w:p>
             <w:r>
-              <w:t>81.134</w:t>
-            </w:r>
-          </w:p>
-        </w:tc>
-        <w:tc>
-          <w:tcPr>
-            <w:tcW w:type="dxa" w:w="864"/>
-          </w:tcPr>
-          <w:p>
-            <w:r>
-              <w:t>85.000</w:t>
-            </w:r>
-          </w:p>
-        </w:tc>
-        <w:tc>
-          <w:tcPr>
-            <w:tcW w:type="dxa" w:w="864"/>
-          </w:tcPr>
-          <w:p>
-            <w:r>
-              <w:t>97</w:t>
-            </w:r>
-          </w:p>
-        </w:tc>
-        <w:tc>
-          <w:tcPr>
-            <w:tcW w:type="dxa" w:w="864"/>
-          </w:tcPr>
-          <w:p>
-            <w:r>
-              <w:t>93</w:t>
+              <w:t>81.667</w:t>
+            </w:r>
+          </w:p>
+        </w:tc>
+        <w:tc>
+          <w:tcPr>
+            <w:tcW w:type="dxa" w:w="864"/>
+          </w:tcPr>
+          <w:p>
+            <w:r>
+              <w:t>80.000</w:t>
+            </w:r>
+          </w:p>
+        </w:tc>
+        <w:tc>
+          <w:tcPr>
+            <w:tcW w:type="dxa" w:w="864"/>
+          </w:tcPr>
+          <w:p>
+            <w:r>
+              <w:t>3</w:t>
+            </w:r>
+          </w:p>
+        </w:tc>
+        <w:tc>
+          <w:tcPr>
+            <w:tcW w:type="dxa" w:w="864"/>
+          </w:tcPr>
+          <w:p>
+            <w:r>
+              <w:t>3</w:t>
             </w:r>
           </w:p>
         </w:tc>
@@ -4460,6 +4460,16 @@
           </w:tcPr>
           <w:p>
             <w:r>
+              <w:t>232</w:t>
+            </w:r>
+          </w:p>
+        </w:tc>
+        <w:tc>
+          <w:tcPr>
+            <w:tcW w:type="dxa" w:w="864"/>
+          </w:tcPr>
+          <w:p>
+            <w:r>
               <w:t>0</w:t>
             </w:r>
           </w:p>
@@ -4480,47 +4490,37 @@
           </w:tcPr>
           <w:p>
             <w:r>
-              <w:t>2</w:t>
-            </w:r>
-          </w:p>
-        </w:tc>
-        <w:tc>
-          <w:tcPr>
-            <w:tcW w:type="dxa" w:w="864"/>
-          </w:tcPr>
-          <w:p>
-            <w:r>
-              <w:t>77.282</w:t>
-            </w:r>
-          </w:p>
-        </w:tc>
-        <w:tc>
-          <w:tcPr>
-            <w:tcW w:type="dxa" w:w="864"/>
-          </w:tcPr>
-          <w:p>
-            <w:r>
-              <w:t>85.000</w:t>
-            </w:r>
-          </w:p>
-        </w:tc>
-        <w:tc>
-          <w:tcPr>
-            <w:tcW w:type="dxa" w:w="864"/>
-          </w:tcPr>
-          <w:p>
-            <w:r>
-              <w:t>464</w:t>
-            </w:r>
-          </w:p>
-        </w:tc>
-        <w:tc>
-          <w:tcPr>
-            <w:tcW w:type="dxa" w:w="864"/>
-          </w:tcPr>
-          <w:p>
-            <w:r>
-              <w:t>401</w:t>
+              <w:t>—</w:t>
+            </w:r>
+          </w:p>
+        </w:tc>
+        <w:tc>
+          <w:tcPr>
+            <w:tcW w:type="dxa" w:w="864"/>
+          </w:tcPr>
+          <w:p>
+            <w:r>
+              <w:t>—</w:t>
+            </w:r>
+          </w:p>
+        </w:tc>
+        <w:tc>
+          <w:tcPr>
+            <w:tcW w:type="dxa" w:w="864"/>
+          </w:tcPr>
+          <w:p>
+            <w:r>
+              <w:t>0</w:t>
+            </w:r>
+          </w:p>
+        </w:tc>
+        <w:tc>
+          <w:tcPr>
+            <w:tcW w:type="dxa" w:w="864"/>
+          </w:tcPr>
+          <w:p>
+            <w:r>
+              <w:t>0</w:t>
             </w:r>
           </w:p>
         </w:tc>
@@ -4562,7 +4562,7 @@
           </w:tcPr>
           <w:p>
             <w:r>
-              <w:t>0</w:t>
+              <w:t>198</w:t>
             </w:r>
           </w:p>
         </w:tc>
@@ -4592,37 +4592,37 @@
           </w:tcPr>
           <w:p>
             <w:r>
-              <w:t>72.771</w:t>
-            </w:r>
-          </w:p>
-        </w:tc>
-        <w:tc>
-          <w:tcPr>
-            <w:tcW w:type="dxa" w:w="864"/>
-          </w:tcPr>
-          <w:p>
-            <w:r>
-              <w:t>80.000</w:t>
-            </w:r>
-          </w:p>
-        </w:tc>
-        <w:tc>
-          <w:tcPr>
-            <w:tcW w:type="dxa" w:w="864"/>
-          </w:tcPr>
-          <w:p>
-            <w:r>
-              <w:t>406</w:t>
-            </w:r>
-          </w:p>
-        </w:tc>
-        <w:tc>
-          <w:tcPr>
-            <w:tcW w:type="dxa" w:w="864"/>
-          </w:tcPr>
-          <w:p>
-            <w:r>
-              <w:t>336</w:t>
+              <w:t>41.000</w:t>
+            </w:r>
+          </w:p>
+        </w:tc>
+        <w:tc>
+          <w:tcPr>
+            <w:tcW w:type="dxa" w:w="864"/>
+          </w:tcPr>
+          <w:p>
+            <w:r>
+              <w:t>20.000</w:t>
+            </w:r>
+          </w:p>
+        </w:tc>
+        <w:tc>
+          <w:tcPr>
+            <w:tcW w:type="dxa" w:w="864"/>
+          </w:tcPr>
+          <w:p>
+            <w:r>
+              <w:t>10</w:t>
+            </w:r>
+          </w:p>
+        </w:tc>
+        <w:tc>
+          <w:tcPr>
+            <w:tcW w:type="dxa" w:w="864"/>
+          </w:tcPr>
+          <w:p>
+            <w:r>
+              <w:t>4</w:t>
             </w:r>
           </w:p>
         </w:tc>
@@ -4664,7 +4664,7 @@
           </w:tcPr>
           <w:p>
             <w:r>
-              <w:t>0</w:t>
+              <w:t>391</w:t>
             </w:r>
           </w:p>
         </w:tc>
@@ -4694,37 +4694,37 @@
           </w:tcPr>
           <w:p>
             <w:r>
-              <w:t>19.937</w:t>
-            </w:r>
-          </w:p>
-        </w:tc>
-        <w:tc>
-          <w:tcPr>
-            <w:tcW w:type="dxa" w:w="864"/>
-          </w:tcPr>
-          <w:p>
-            <w:r>
-              <w:t>0.000</w:t>
-            </w:r>
-          </w:p>
-        </w:tc>
-        <w:tc>
-          <w:tcPr>
-            <w:tcW w:type="dxa" w:w="864"/>
-          </w:tcPr>
-          <w:p>
-            <w:r>
-              <w:t>394</w:t>
-            </w:r>
-          </w:p>
-        </w:tc>
-        <w:tc>
-          <w:tcPr>
-            <w:tcW w:type="dxa" w:w="864"/>
-          </w:tcPr>
-          <w:p>
-            <w:r>
-              <w:t>71</w:t>
+              <w:t>43.333</w:t>
+            </w:r>
+          </w:p>
+        </w:tc>
+        <w:tc>
+          <w:tcPr>
+            <w:tcW w:type="dxa" w:w="864"/>
+          </w:tcPr>
+          <w:p>
+            <w:r>
+              <w:t>20.000</w:t>
+            </w:r>
+          </w:p>
+        </w:tc>
+        <w:tc>
+          <w:tcPr>
+            <w:tcW w:type="dxa" w:w="864"/>
+          </w:tcPr>
+          <w:p>
+            <w:r>
+              <w:t>3</w:t>
+            </w:r>
+          </w:p>
+        </w:tc>
+        <w:tc>
+          <w:tcPr>
+            <w:tcW w:type="dxa" w:w="864"/>
+          </w:tcPr>
+          <w:p>
+            <w:r>
+              <w:t>1</w:t>
             </w:r>
           </w:p>
         </w:tc>
@@ -4766,67 +4766,67 @@
           </w:tcPr>
           <w:p>
             <w:r>
+              <w:t>291</w:t>
+            </w:r>
+          </w:p>
+        </w:tc>
+        <w:tc>
+          <w:tcPr>
+            <w:tcW w:type="dxa" w:w="864"/>
+          </w:tcPr>
+          <w:p>
+            <w:r>
+              <w:t>5</w:t>
+            </w:r>
+          </w:p>
+        </w:tc>
+        <w:tc>
+          <w:tcPr>
+            <w:tcW w:type="dxa" w:w="864"/>
+          </w:tcPr>
+          <w:p>
+            <w:r>
+              <w:t>1</w:t>
+            </w:r>
+          </w:p>
+        </w:tc>
+        <w:tc>
+          <w:tcPr>
+            <w:tcW w:type="dxa" w:w="864"/>
+          </w:tcPr>
+          <w:p>
+            <w:r>
+              <w:t>16.000</w:t>
+            </w:r>
+          </w:p>
+        </w:tc>
+        <w:tc>
+          <w:tcPr>
+            <w:tcW w:type="dxa" w:w="864"/>
+          </w:tcPr>
+          <w:p>
+            <w:r>
+              <w:t>20.000</w:t>
+            </w:r>
+          </w:p>
+        </w:tc>
+        <w:tc>
+          <w:tcPr>
+            <w:tcW w:type="dxa" w:w="864"/>
+          </w:tcPr>
+          <w:p>
+            <w:r>
+              <w:t>5</w:t>
+            </w:r>
+          </w:p>
+        </w:tc>
+        <w:tc>
+          <w:tcPr>
+            <w:tcW w:type="dxa" w:w="864"/>
+          </w:tcPr>
+          <w:p>
+            <w:r>
               <w:t>0</w:t>
-            </w:r>
-          </w:p>
-        </w:tc>
-        <w:tc>
-          <w:tcPr>
-            <w:tcW w:type="dxa" w:w="864"/>
-          </w:tcPr>
-          <w:p>
-            <w:r>
-              <w:t>5</w:t>
-            </w:r>
-          </w:p>
-        </w:tc>
-        <w:tc>
-          <w:tcPr>
-            <w:tcW w:type="dxa" w:w="864"/>
-          </w:tcPr>
-          <w:p>
-            <w:r>
-              <w:t>1</w:t>
-            </w:r>
-          </w:p>
-        </w:tc>
-        <w:tc>
-          <w:tcPr>
-            <w:tcW w:type="dxa" w:w="864"/>
-          </w:tcPr>
-          <w:p>
-            <w:r>
-              <w:t>19.591</w:t>
-            </w:r>
-          </w:p>
-        </w:tc>
-        <w:tc>
-          <w:tcPr>
-            <w:tcW w:type="dxa" w:w="864"/>
-          </w:tcPr>
-          <w:p>
-            <w:r>
-              <w:t>20.000</w:t>
-            </w:r>
-          </w:p>
-        </w:tc>
-        <w:tc>
-          <w:tcPr>
-            <w:tcW w:type="dxa" w:w="864"/>
-          </w:tcPr>
-          <w:p>
-            <w:r>
-              <w:t>296</w:t>
-            </w:r>
-          </w:p>
-        </w:tc>
-        <w:tc>
-          <w:tcPr>
-            <w:tcW w:type="dxa" w:w="864"/>
-          </w:tcPr>
-          <w:p>
-            <w:r>
-              <w:t>20</w:t>
             </w:r>
           </w:p>
         </w:tc>
@@ -4868,7 +4868,7 @@
           </w:tcPr>
           <w:p>
             <w:r>
-              <w:t>0</w:t>
+              <w:t>231</w:t>
             </w:r>
           </w:p>
         </w:tc>
@@ -4898,37 +4898,37 @@
           </w:tcPr>
           <w:p>
             <w:r>
-              <w:t>68.377</w:t>
-            </w:r>
-          </w:p>
-        </w:tc>
-        <w:tc>
-          <w:tcPr>
-            <w:tcW w:type="dxa" w:w="864"/>
-          </w:tcPr>
-          <w:p>
-            <w:r>
-              <w:t>85.000</w:t>
-            </w:r>
-          </w:p>
-        </w:tc>
-        <w:tc>
-          <w:tcPr>
-            <w:tcW w:type="dxa" w:w="864"/>
-          </w:tcPr>
-          <w:p>
-            <w:r>
-              <w:t>236</w:t>
-            </w:r>
-          </w:p>
-        </w:tc>
-        <w:tc>
-          <w:tcPr>
-            <w:tcW w:type="dxa" w:w="864"/>
-          </w:tcPr>
-          <w:p>
-            <w:r>
-              <w:t>172</w:t>
+              <w:t>91.000</w:t>
+            </w:r>
+          </w:p>
+        </w:tc>
+        <w:tc>
+          <w:tcPr>
+            <w:tcW w:type="dxa" w:w="864"/>
+          </w:tcPr>
+          <w:p>
+            <w:r>
+              <w:t>90.000</w:t>
+            </w:r>
+          </w:p>
+        </w:tc>
+        <w:tc>
+          <w:tcPr>
+            <w:tcW w:type="dxa" w:w="864"/>
+          </w:tcPr>
+          <w:p>
+            <w:r>
+              <w:t>5</w:t>
+            </w:r>
+          </w:p>
+        </w:tc>
+        <w:tc>
+          <w:tcPr>
+            <w:tcW w:type="dxa" w:w="864"/>
+          </w:tcPr>
+          <w:p>
+            <w:r>
+              <w:t>5</w:t>
             </w:r>
           </w:p>
         </w:tc>
@@ -4970,7 +4970,7 @@
           </w:tcPr>
           <w:p>
             <w:r>
-              <w:t>0</w:t>
+              <w:t>60</w:t>
             </w:r>
           </w:p>
         </w:tc>
@@ -5000,16 +5000,6 @@
           </w:tcPr>
           <w:p>
             <w:r>
-              <w:t>77.968</w:t>
-            </w:r>
-          </w:p>
-        </w:tc>
-        <w:tc>
-          <w:tcPr>
-            <w:tcW w:type="dxa" w:w="864"/>
-          </w:tcPr>
-          <w:p>
-            <w:r>
               <w:t>80.000</w:t>
             </w:r>
           </w:p>
@@ -5020,17 +5010,27 @@
           </w:tcPr>
           <w:p>
             <w:r>
-              <w:t>63</w:t>
-            </w:r>
-          </w:p>
-        </w:tc>
-        <w:tc>
-          <w:tcPr>
-            <w:tcW w:type="dxa" w:w="864"/>
-          </w:tcPr>
-          <w:p>
-            <w:r>
-              <w:t>57</w:t>
+              <w:t>80.000</w:t>
+            </w:r>
+          </w:p>
+        </w:tc>
+        <w:tc>
+          <w:tcPr>
+            <w:tcW w:type="dxa" w:w="864"/>
+          </w:tcPr>
+          <w:p>
+            <w:r>
+              <w:t>3</w:t>
+            </w:r>
+          </w:p>
+        </w:tc>
+        <w:tc>
+          <w:tcPr>
+            <w:tcW w:type="dxa" w:w="864"/>
+          </w:tcPr>
+          <w:p>
+            <w:r>
+              <w:t>3</w:t>
             </w:r>
           </w:p>
         </w:tc>
@@ -5072,7 +5072,7 @@
           </w:tcPr>
           <w:p>
             <w:r>
-              <w:t>0</w:t>
+              <w:t>402</w:t>
             </w:r>
           </w:p>
         </w:tc>
@@ -5102,7 +5102,7 @@
           </w:tcPr>
           <w:p>
             <w:r>
-              <w:t>40.061</w:t>
+              <w:t>34.000</w:t>
             </w:r>
           </w:p>
         </w:tc>
@@ -5122,17 +5122,17 @@
           </w:tcPr>
           <w:p>
             <w:r>
-              <w:t>407</w:t>
-            </w:r>
-          </w:p>
-        </w:tc>
-        <w:tc>
-          <w:tcPr>
-            <w:tcW w:type="dxa" w:w="864"/>
-          </w:tcPr>
-          <w:p>
-            <w:r>
-              <w:t>137</w:t>
+              <w:t>5</w:t>
+            </w:r>
+          </w:p>
+        </w:tc>
+        <w:tc>
+          <w:tcPr>
+            <w:tcW w:type="dxa" w:w="864"/>
+          </w:tcPr>
+          <w:p>
+            <w:r>
+              <w:t>1</w:t>
             </w:r>
           </w:p>
         </w:tc>
@@ -5174,6 +5174,16 @@
           </w:tcPr>
           <w:p>
             <w:r>
+              <w:t>81</w:t>
+            </w:r>
+          </w:p>
+        </w:tc>
+        <w:tc>
+          <w:tcPr>
+            <w:tcW w:type="dxa" w:w="864"/>
+          </w:tcPr>
+          <w:p>
+            <w:r>
               <w:t>0</w:t>
             </w:r>
           </w:p>
@@ -5194,47 +5204,37 @@
           </w:tcPr>
           <w:p>
             <w:r>
-              <w:t>1</w:t>
-            </w:r>
-          </w:p>
-        </w:tc>
-        <w:tc>
-          <w:tcPr>
-            <w:tcW w:type="dxa" w:w="864"/>
-          </w:tcPr>
-          <w:p>
-            <w:r>
-              <w:t>89.605</w:t>
-            </w:r>
-          </w:p>
-        </w:tc>
-        <w:tc>
-          <w:tcPr>
-            <w:tcW w:type="dxa" w:w="864"/>
-          </w:tcPr>
-          <w:p>
-            <w:r>
-              <w:t>90.000</w:t>
-            </w:r>
-          </w:p>
-        </w:tc>
-        <w:tc>
-          <w:tcPr>
-            <w:tcW w:type="dxa" w:w="864"/>
-          </w:tcPr>
-          <w:p>
-            <w:r>
-              <w:t>81</w:t>
-            </w:r>
-          </w:p>
-        </w:tc>
-        <w:tc>
-          <w:tcPr>
-            <w:tcW w:type="dxa" w:w="864"/>
-          </w:tcPr>
-          <w:p>
-            <w:r>
-              <w:t>79</w:t>
+              <w:t>—</w:t>
+            </w:r>
+          </w:p>
+        </w:tc>
+        <w:tc>
+          <w:tcPr>
+            <w:tcW w:type="dxa" w:w="864"/>
+          </w:tcPr>
+          <w:p>
+            <w:r>
+              <w:t>—</w:t>
+            </w:r>
+          </w:p>
+        </w:tc>
+        <w:tc>
+          <w:tcPr>
+            <w:tcW w:type="dxa" w:w="864"/>
+          </w:tcPr>
+          <w:p>
+            <w:r>
+              <w:t>0</w:t>
+            </w:r>
+          </w:p>
+        </w:tc>
+        <w:tc>
+          <w:tcPr>
+            <w:tcW w:type="dxa" w:w="864"/>
+          </w:tcPr>
+          <w:p>
+            <w:r>
+              <w:t>0</w:t>
             </w:r>
           </w:p>
         </w:tc>
@@ -5276,6 +5276,16 @@
           </w:tcPr>
           <w:p>
             <w:r>
+              <w:t>115</w:t>
+            </w:r>
+          </w:p>
+        </w:tc>
+        <w:tc>
+          <w:tcPr>
+            <w:tcW w:type="dxa" w:w="864"/>
+          </w:tcPr>
+          <w:p>
+            <w:r>
               <w:t>0</w:t>
             </w:r>
           </w:p>
@@ -5296,47 +5306,37 @@
           </w:tcPr>
           <w:p>
             <w:r>
-              <w:t>1</w:t>
-            </w:r>
-          </w:p>
-        </w:tc>
-        <w:tc>
-          <w:tcPr>
-            <w:tcW w:type="dxa" w:w="864"/>
-          </w:tcPr>
-          <w:p>
-            <w:r>
-              <w:t>70.130</w:t>
-            </w:r>
-          </w:p>
-        </w:tc>
-        <w:tc>
-          <w:tcPr>
-            <w:tcW w:type="dxa" w:w="864"/>
-          </w:tcPr>
-          <w:p>
-            <w:r>
-              <w:t>80.000</w:t>
-            </w:r>
-          </w:p>
-        </w:tc>
-        <w:tc>
-          <w:tcPr>
-            <w:tcW w:type="dxa" w:w="864"/>
-          </w:tcPr>
-          <w:p>
-            <w:r>
-              <w:t>115</w:t>
-            </w:r>
-          </w:p>
-        </w:tc>
-        <w:tc>
-          <w:tcPr>
-            <w:tcW w:type="dxa" w:w="864"/>
-          </w:tcPr>
-          <w:p>
-            <w:r>
-              <w:t>94</w:t>
+              <w:t>—</w:t>
+            </w:r>
+          </w:p>
+        </w:tc>
+        <w:tc>
+          <w:tcPr>
+            <w:tcW w:type="dxa" w:w="864"/>
+          </w:tcPr>
+          <w:p>
+            <w:r>
+              <w:t>—</w:t>
+            </w:r>
+          </w:p>
+        </w:tc>
+        <w:tc>
+          <w:tcPr>
+            <w:tcW w:type="dxa" w:w="864"/>
+          </w:tcPr>
+          <w:p>
+            <w:r>
+              <w:t>0</w:t>
+            </w:r>
+          </w:p>
+        </w:tc>
+        <w:tc>
+          <w:tcPr>
+            <w:tcW w:type="dxa" w:w="864"/>
+          </w:tcPr>
+          <w:p>
+            <w:r>
+              <w:t>0</w:t>
             </w:r>
           </w:p>
         </w:tc>
@@ -5378,7 +5378,7 @@
           </w:tcPr>
           <w:p>
             <w:r>
-              <w:t>0</w:t>
+              <w:t>1729</w:t>
             </w:r>
           </w:p>
         </w:tc>
@@ -5408,7 +5408,7 @@
           </w:tcPr>
           <w:p>
             <w:r>
-              <w:t>32.700</w:t>
+              <w:t>42.500</w:t>
             </w:r>
           </w:p>
         </w:tc>
@@ -5428,17 +5428,17 @@
           </w:tcPr>
           <w:p>
             <w:r>
-              <w:t>1735</w:t>
-            </w:r>
-          </w:p>
-        </w:tc>
-        <w:tc>
-          <w:tcPr>
-            <w:tcW w:type="dxa" w:w="864"/>
-          </w:tcPr>
-          <w:p>
-            <w:r>
-              <w:t>424</w:t>
+              <w:t>6</w:t>
+            </w:r>
+          </w:p>
+        </w:tc>
+        <w:tc>
+          <w:tcPr>
+            <w:tcW w:type="dxa" w:w="864"/>
+          </w:tcPr>
+          <w:p>
+            <w:r>
+              <w:t>2</w:t>
             </w:r>
           </w:p>
         </w:tc>
@@ -5480,7 +5480,7 @@
           </w:tcPr>
           <w:p>
             <w:r>
-              <w:t>0</w:t>
+              <w:t>78</w:t>
             </w:r>
           </w:p>
         </w:tc>
@@ -5510,37 +5510,37 @@
           </w:tcPr>
           <w:p>
             <w:r>
-              <w:t>65.627</w:t>
-            </w:r>
-          </w:p>
-        </w:tc>
-        <w:tc>
-          <w:tcPr>
-            <w:tcW w:type="dxa" w:w="864"/>
-          </w:tcPr>
-          <w:p>
-            <w:r>
-              <w:t>85.000</w:t>
-            </w:r>
-          </w:p>
-        </w:tc>
-        <w:tc>
-          <w:tcPr>
-            <w:tcW w:type="dxa" w:w="864"/>
-          </w:tcPr>
-          <w:p>
-            <w:r>
-              <w:t>83</w:t>
-            </w:r>
-          </w:p>
-        </w:tc>
-        <w:tc>
-          <w:tcPr>
-            <w:tcW w:type="dxa" w:w="864"/>
-          </w:tcPr>
-          <w:p>
-            <w:r>
-              <w:t>59</w:t>
+              <w:t>86.000</w:t>
+            </w:r>
+          </w:p>
+        </w:tc>
+        <w:tc>
+          <w:tcPr>
+            <w:tcW w:type="dxa" w:w="864"/>
+          </w:tcPr>
+          <w:p>
+            <w:r>
+              <w:t>90.000</w:t>
+            </w:r>
+          </w:p>
+        </w:tc>
+        <w:tc>
+          <w:tcPr>
+            <w:tcW w:type="dxa" w:w="864"/>
+          </w:tcPr>
+          <w:p>
+            <w:r>
+              <w:t>5</w:t>
+            </w:r>
+          </w:p>
+        </w:tc>
+        <w:tc>
+          <w:tcPr>
+            <w:tcW w:type="dxa" w:w="864"/>
+          </w:tcPr>
+          <w:p>
+            <w:r>
+              <w:t>5</w:t>
             </w:r>
           </w:p>
         </w:tc>
@@ -5582,67 +5582,67 @@
           </w:tcPr>
           <w:p>
             <w:r>
+              <w:t>730</w:t>
+            </w:r>
+          </w:p>
+        </w:tc>
+        <w:tc>
+          <w:tcPr>
+            <w:tcW w:type="dxa" w:w="864"/>
+          </w:tcPr>
+          <w:p>
+            <w:r>
+              <w:t>6</w:t>
+            </w:r>
+          </w:p>
+        </w:tc>
+        <w:tc>
+          <w:tcPr>
+            <w:tcW w:type="dxa" w:w="864"/>
+          </w:tcPr>
+          <w:p>
+            <w:r>
+              <w:t>1</w:t>
+            </w:r>
+          </w:p>
+        </w:tc>
+        <w:tc>
+          <w:tcPr>
+            <w:tcW w:type="dxa" w:w="864"/>
+          </w:tcPr>
+          <w:p>
+            <w:r>
+              <w:t>13.333</w:t>
+            </w:r>
+          </w:p>
+        </w:tc>
+        <w:tc>
+          <w:tcPr>
+            <w:tcW w:type="dxa" w:w="864"/>
+          </w:tcPr>
+          <w:p>
+            <w:r>
+              <w:t>20.000</w:t>
+            </w:r>
+          </w:p>
+        </w:tc>
+        <w:tc>
+          <w:tcPr>
+            <w:tcW w:type="dxa" w:w="864"/>
+          </w:tcPr>
+          <w:p>
+            <w:r>
+              <w:t>6</w:t>
+            </w:r>
+          </w:p>
+        </w:tc>
+        <w:tc>
+          <w:tcPr>
+            <w:tcW w:type="dxa" w:w="864"/>
+          </w:tcPr>
+          <w:p>
+            <w:r>
               <w:t>0</w:t>
-            </w:r>
-          </w:p>
-        </w:tc>
-        <w:tc>
-          <w:tcPr>
-            <w:tcW w:type="dxa" w:w="864"/>
-          </w:tcPr>
-          <w:p>
-            <w:r>
-              <w:t>6</w:t>
-            </w:r>
-          </w:p>
-        </w:tc>
-        <w:tc>
-          <w:tcPr>
-            <w:tcW w:type="dxa" w:w="864"/>
-          </w:tcPr>
-          <w:p>
-            <w:r>
-              <w:t>1</w:t>
-            </w:r>
-          </w:p>
-        </w:tc>
-        <w:tc>
-          <w:tcPr>
-            <w:tcW w:type="dxa" w:w="864"/>
-          </w:tcPr>
-          <w:p>
-            <w:r>
-              <w:t>26.781</w:t>
-            </w:r>
-          </w:p>
-        </w:tc>
-        <w:tc>
-          <w:tcPr>
-            <w:tcW w:type="dxa" w:w="864"/>
-          </w:tcPr>
-          <w:p>
-            <w:r>
-              <w:t>20.000</w:t>
-            </w:r>
-          </w:p>
-        </w:tc>
-        <w:tc>
-          <w:tcPr>
-            <w:tcW w:type="dxa" w:w="864"/>
-          </w:tcPr>
-          <w:p>
-            <w:r>
-              <w:t>736</w:t>
-            </w:r>
-          </w:p>
-        </w:tc>
-        <w:tc>
-          <w:tcPr>
-            <w:tcW w:type="dxa" w:w="864"/>
-          </w:tcPr>
-          <w:p>
-            <w:r>
-              <w:t>122</w:t>
             </w:r>
           </w:p>
         </w:tc>
@@ -5684,7 +5684,7 @@
           </w:tcPr>
           <w:p>
             <w:r>
-              <w:t>0</w:t>
+              <w:t>138</w:t>
             </w:r>
           </w:p>
         </w:tc>
@@ -5714,37 +5714,37 @@
           </w:tcPr>
           <w:p>
             <w:r>
-              <w:t>85.993</w:t>
-            </w:r>
-          </w:p>
-        </w:tc>
-        <w:tc>
-          <w:tcPr>
-            <w:tcW w:type="dxa" w:w="864"/>
-          </w:tcPr>
-          <w:p>
-            <w:r>
-              <w:t>90.000</w:t>
-            </w:r>
-          </w:p>
-        </w:tc>
-        <w:tc>
-          <w:tcPr>
-            <w:tcW w:type="dxa" w:w="864"/>
-          </w:tcPr>
-          <w:p>
-            <w:r>
-              <w:t>139</w:t>
-            </w:r>
-          </w:p>
-        </w:tc>
-        <w:tc>
-          <w:tcPr>
-            <w:tcW w:type="dxa" w:w="864"/>
-          </w:tcPr>
-          <w:p>
-            <w:r>
-              <w:t>133</w:t>
+              <w:t>80.000</w:t>
+            </w:r>
+          </w:p>
+        </w:tc>
+        <w:tc>
+          <w:tcPr>
+            <w:tcW w:type="dxa" w:w="864"/>
+          </w:tcPr>
+          <w:p>
+            <w:r>
+              <w:t>80.000</w:t>
+            </w:r>
+          </w:p>
+        </w:tc>
+        <w:tc>
+          <w:tcPr>
+            <w:tcW w:type="dxa" w:w="864"/>
+          </w:tcPr>
+          <w:p>
+            <w:r>
+              <w:t>1</w:t>
+            </w:r>
+          </w:p>
+        </w:tc>
+        <w:tc>
+          <w:tcPr>
+            <w:tcW w:type="dxa" w:w="864"/>
+          </w:tcPr>
+          <w:p>
+            <w:r>
+              <w:t>1</w:t>
             </w:r>
           </w:p>
         </w:tc>
@@ -5786,7 +5786,7 @@
           </w:tcPr>
           <w:p>
             <w:r>
-              <w:t>0</w:t>
+              <w:t>235</w:t>
             </w:r>
           </w:p>
         </w:tc>
@@ -5816,7 +5816,7 @@
           </w:tcPr>
           <w:p>
             <w:r>
-              <w:t>30.326</w:t>
+              <w:t>22.500</w:t>
             </w:r>
           </w:p>
         </w:tc>
@@ -5836,17 +5836,17 @@
           </w:tcPr>
           <w:p>
             <w:r>
-              <w:t>482</w:t>
-            </w:r>
-          </w:p>
-        </w:tc>
-        <w:tc>
-          <w:tcPr>
-            <w:tcW w:type="dxa" w:w="864"/>
-          </w:tcPr>
-          <w:p>
-            <w:r>
-              <w:t>100</w:t>
+              <w:t>12</w:t>
+            </w:r>
+          </w:p>
+        </w:tc>
+        <w:tc>
+          <w:tcPr>
+            <w:tcW w:type="dxa" w:w="864"/>
+          </w:tcPr>
+          <w:p>
+            <w:r>
+              <w:t>2</w:t>
             </w:r>
           </w:p>
         </w:tc>

</xml_diff>